<commit_message>
vault backup: 2025-09-01 21:00:46
</commit_message>
<xml_diff>
--- a/content/SEP_Study_Plan_Template.docx
+++ b/content/SEP_Study_Plan_Template.docx
@@ -1,10 +1,10 @@
 
 <file path=word/document.xml><?xml version="1.0" encoding="utf-8"?>
-<w:document xmlns:wpc="http://schemas.microsoft.com/office/word/2010/wordprocessingCanvas" xmlns:cx="http://schemas.microsoft.com/office/drawing/2014/chartex" xmlns:cx1="http://schemas.microsoft.com/office/drawing/2015/9/8/chartex" xmlns:cx2="http://schemas.microsoft.com/office/drawing/2015/10/21/chartex" xmlns:cx3="http://schemas.microsoft.com/office/drawing/2016/5/9/chartex" xmlns:cx4="http://schemas.microsoft.com/office/drawing/2016/5/10/chartex" xmlns:cx5="http://schemas.microsoft.com/office/drawing/2016/5/11/chartex" xmlns:cx6="http://schemas.microsoft.com/office/drawing/2016/5/12/chartex" xmlns:cx7="http://schemas.microsoft.com/office/drawing/2016/5/13/chartex" xmlns:cx8="http://schemas.microsoft.com/office/drawing/2016/5/14/chartex" xmlns:mc="http://schemas.openxmlformats.org/markup-compatibility/2006" xmlns:aink="http://schemas.microsoft.com/office/drawing/2016/ink" xmlns:am3d="http://schemas.microsoft.com/office/drawing/2017/model3d" xmlns:o="urn:schemas-microsoft-com:office:office" xmlns:oel="http://schemas.microsoft.com/office/2019/extlst" xmlns:r="http://schemas.openxmlformats.org/officeDocument/2006/relationships" xmlns:m="http://schemas.openxmlformats.org/officeDocument/2006/math" xmlns:v="urn:schemas-microsoft-com:vml" xmlns:wp14="http://schemas.microsoft.com/office/word/2010/wordprocessingDrawing" xmlns:wp="http://schemas.openxmlformats.org/drawingml/2006/wordprocessingDrawing" xmlns:w10="urn:schemas-microsoft-com:office:word" xmlns:w="http://schemas.openxmlformats.org/wordprocessingml/2006/main" xmlns:w14="http://schemas.microsoft.com/office/word/2010/wordml" xmlns:w15="http://schemas.microsoft.com/office/word/2012/wordml" xmlns:w16cex="http://schemas.microsoft.com/office/word/2018/wordml/cex" xmlns:w16cid="http://schemas.microsoft.com/office/word/2016/wordml/cid" xmlns:w16="http://schemas.microsoft.com/office/word/2018/wordml" xmlns:w16sdtdh="http://schemas.microsoft.com/office/word/2020/wordml/sdtdatahash" xmlns:w16se="http://schemas.microsoft.com/office/word/2015/wordml/symex" xmlns:wpg="http://schemas.microsoft.com/office/word/2010/wordprocessingGroup" xmlns:wpi="http://schemas.microsoft.com/office/word/2010/wordprocessingInk" xmlns:wne="http://schemas.microsoft.com/office/word/2006/wordml" xmlns:wps="http://schemas.microsoft.com/office/word/2010/wordprocessingShape" mc:Ignorable="w14 w15 w16se w16cid w16 w16cex w16sdtdh wp14">
+<w:document xmlns:wpc="http://schemas.microsoft.com/office/word/2010/wordprocessingCanvas" xmlns:cx="http://schemas.microsoft.com/office/drawing/2014/chartex" xmlns:cx1="http://schemas.microsoft.com/office/drawing/2015/9/8/chartex" xmlns:cx2="http://schemas.microsoft.com/office/drawing/2015/10/21/chartex" xmlns:cx3="http://schemas.microsoft.com/office/drawing/2016/5/9/chartex" xmlns:cx4="http://schemas.microsoft.com/office/drawing/2016/5/10/chartex" xmlns:cx5="http://schemas.microsoft.com/office/drawing/2016/5/11/chartex" xmlns:cx6="http://schemas.microsoft.com/office/drawing/2016/5/12/chartex" xmlns:cx7="http://schemas.microsoft.com/office/drawing/2016/5/13/chartex" xmlns:cx8="http://schemas.microsoft.com/office/drawing/2016/5/14/chartex" xmlns:mc="http://schemas.openxmlformats.org/markup-compatibility/2006" xmlns:aink="http://schemas.microsoft.com/office/drawing/2016/ink" xmlns:am3d="http://schemas.microsoft.com/office/drawing/2017/model3d" xmlns:o="urn:schemas-microsoft-com:office:office" xmlns:oel="http://schemas.microsoft.com/office/2019/extlst" xmlns:r="http://schemas.openxmlformats.org/officeDocument/2006/relationships" xmlns:m="http://schemas.openxmlformats.org/officeDocument/2006/math" xmlns:v="urn:schemas-microsoft-com:vml" xmlns:wp14="http://schemas.microsoft.com/office/word/2010/wordprocessingDrawing" xmlns:wp="http://schemas.openxmlformats.org/drawingml/2006/wordprocessingDrawing" xmlns:w10="urn:schemas-microsoft-com:office:word" xmlns:w="http://schemas.openxmlformats.org/wordprocessingml/2006/main" xmlns:w14="http://schemas.microsoft.com/office/word/2010/wordml" xmlns:w15="http://schemas.microsoft.com/office/word/2012/wordml" xmlns:w16cex="http://schemas.microsoft.com/office/word/2018/wordml/cex" xmlns:w16cid="http://schemas.microsoft.com/office/word/2016/wordml/cid" xmlns:w16="http://schemas.microsoft.com/office/word/2018/wordml" xmlns:w16du="http://schemas.microsoft.com/office/word/2023/wordml/word16du" xmlns:w16sdtdh="http://schemas.microsoft.com/office/word/2020/wordml/sdtdatahash" xmlns:w16se="http://schemas.microsoft.com/office/word/2015/wordml/symex" xmlns:wpg="http://schemas.microsoft.com/office/word/2010/wordprocessingGroup" xmlns:wpi="http://schemas.microsoft.com/office/word/2010/wordprocessingInk" xmlns:wne="http://schemas.microsoft.com/office/word/2006/wordml" xmlns:wps="http://schemas.microsoft.com/office/word/2010/wordprocessingShape" mc:Ignorable="w14 w15 w16se w16cid w16 w16cex w16sdtdh w16du wp14">
   <w:body>
     <w:tbl>
       <w:tblPr>
-        <w:tblW w:w="9270" w:type="dxa"/>
+        <w:tblW w:w="9918" w:type="dxa"/>
         <w:tblBorders>
           <w:top w:val="single" w:sz="8" w:space="0" w:color="auto"/>
           <w:left w:val="single" w:sz="8" w:space="0" w:color="auto"/>
@@ -16,9 +16,9 @@
         <w:tblLook w:val="04A0" w:firstRow="1" w:lastRow="0" w:firstColumn="1" w:lastColumn="0" w:noHBand="0" w:noVBand="1"/>
       </w:tblPr>
       <w:tblGrid>
-        <w:gridCol w:w="1260"/>
-        <w:gridCol w:w="1170"/>
-        <w:gridCol w:w="1260"/>
+        <w:gridCol w:w="1520"/>
+        <w:gridCol w:w="1766"/>
+        <w:gridCol w:w="1052"/>
         <w:gridCol w:w="2630"/>
         <w:gridCol w:w="2950"/>
       </w:tblGrid>
@@ -28,7 +28,7 @@
         </w:trPr>
         <w:tc>
           <w:tcPr>
-            <w:tcW w:w="3690" w:type="dxa"/>
+            <w:tcW w:w="4338" w:type="dxa"/>
             <w:gridSpan w:val="3"/>
             <w:tcBorders>
               <w:top w:val="nil"/>
@@ -113,62 +113,8 @@
         </w:trPr>
         <w:tc>
           <w:tcPr>
-            <w:tcW w:w="3690" w:type="dxa"/>
-            <w:gridSpan w:val="3"/>
-            <w:tcBorders>
-              <w:top w:val="nil"/>
-              <w:left w:val="nil"/>
-              <w:bottom w:val="single" w:sz="8" w:space="0" w:color="auto"/>
-              <w:right w:val="nil"/>
-            </w:tcBorders>
-            <w:shd w:val="clear" w:color="auto" w:fill="auto"/>
-            <w:noWrap/>
-            <w:vAlign w:val="bottom"/>
-            <w:hideMark/>
-          </w:tcPr>
-          <w:p>
-            <w:pPr>
-              <w:rPr>
-                <w:rFonts w:eastAsia="Times New Roman"/>
-                <w:b/>
-                <w:bCs/>
-                <w:color w:val="000000"/>
-              </w:rPr>
-            </w:pPr>
-            <w:bookmarkStart w:id="0" w:name="RANGE!A1:E25"/>
-            <w:r>
-              <w:rPr>
-                <w:rFonts w:eastAsia="Times New Roman"/>
-                <w:b/>
-                <w:bCs/>
-                <w:color w:val="000000"/>
-              </w:rPr>
-              <w:t xml:space="preserve">1st choice - ABC University </w:t>
-            </w:r>
-            <w:bookmarkEnd w:id="0"/>
-            <w:r>
-              <w:rPr>
-                <w:rFonts w:eastAsia="Times New Roman"/>
-                <w:b/>
-                <w:bCs/>
-                <w:color w:val="000000"/>
-              </w:rPr>
-              <w:br/>
-            </w:r>
-            <w:r>
-              <w:rPr>
-                <w:rFonts w:eastAsia="Times New Roman"/>
-                <w:b/>
-                <w:bCs/>
-                <w:color w:val="000000"/>
-              </w:rPr>
-              <w:t>Indicate Exchange Semester</w:t>
-            </w:r>
-          </w:p>
-        </w:tc>
-        <w:tc>
-          <w:tcPr>
-            <w:tcW w:w="2630" w:type="dxa"/>
+            <w:tcW w:w="9918" w:type="dxa"/>
+            <w:gridSpan w:val="5"/>
             <w:tcBorders>
               <w:top w:val="nil"/>
               <w:left w:val="nil"/>
@@ -188,30 +134,80 @@
                 <w:szCs w:val="20"/>
               </w:rPr>
             </w:pPr>
-          </w:p>
-        </w:tc>
-        <w:tc>
-          <w:tcPr>
-            <w:tcW w:w="2950" w:type="dxa"/>
-            <w:tcBorders>
-              <w:top w:val="nil"/>
-              <w:left w:val="nil"/>
-              <w:bottom w:val="single" w:sz="8" w:space="0" w:color="auto"/>
-              <w:right w:val="nil"/>
-            </w:tcBorders>
-            <w:shd w:val="clear" w:color="auto" w:fill="auto"/>
-            <w:noWrap/>
-            <w:vAlign w:val="bottom"/>
-            <w:hideMark/>
-          </w:tcPr>
-          <w:p>
-            <w:pPr>
-              <w:rPr>
-                <w:rFonts w:ascii="Times New Roman" w:eastAsia="Times New Roman" w:hAnsi="Times New Roman" w:cs="Times New Roman"/>
+            <w:bookmarkStart w:id="0" w:name="RANGE!A1:E25"/>
+            <w:r>
+              <w:rPr>
+                <w:rFonts w:eastAsia="Times New Roman"/>
+                <w:b/>
+                <w:bCs/>
+                <w:color w:val="000000"/>
+              </w:rPr>
+              <w:t>1st choice -</w:t>
+            </w:r>
+            <w:bookmarkEnd w:id="0"/>
+            <w:r>
+              <w:rPr>
+                <w:rFonts w:eastAsia="Times New Roman"/>
+                <w:b/>
+                <w:bCs/>
+                <w:color w:val="000000"/>
+              </w:rPr>
+              <w:t xml:space="preserve"> </w:t>
+            </w:r>
+            <w:r>
+              <w:rPr>
+                <w:rFonts w:eastAsia="Times New Roman"/>
+                <w:color w:val="000000"/>
+              </w:rPr>
+              <w:t>E0000001062</w:t>
+            </w:r>
+            <w:r>
+              <w:rPr>
+                <w:rFonts w:eastAsia="Times New Roman"/>
+                <w:color w:val="000000"/>
+              </w:rPr>
+              <w:t xml:space="preserve"> </w:t>
+            </w:r>
+            <w:r>
+              <w:rPr>
+                <w:rFonts w:eastAsia="Times New Roman"/>
+                <w:color w:val="000000"/>
+              </w:rPr>
+              <w:t>Aarhus</w:t>
+            </w:r>
+            <w:r>
+              <w:rPr>
+                <w:rFonts w:eastAsia="Times New Roman"/>
+                <w:b/>
+                <w:bCs/>
+                <w:color w:val="000000"/>
+              </w:rPr>
+              <w:t xml:space="preserve"> </w:t>
+            </w:r>
+            <w:r>
+              <w:rPr>
+                <w:rFonts w:eastAsia="Times New Roman"/>
+                <w:color w:val="000000"/>
+              </w:rPr>
+              <w:t>University</w:t>
+            </w:r>
+            <w:r>
+              <w:rPr>
+                <w:rFonts w:eastAsia="Times New Roman"/>
+                <w:b/>
+                <w:bCs/>
+                <w:color w:val="000000"/>
+              </w:rPr>
+              <w:br/>
+            </w:r>
+            <w:r>
+              <w:rPr>
+                <w:rFonts w:eastAsia="Times New Roman"/>
                 <w:sz w:val="20"/>
                 <w:szCs w:val="20"/>
               </w:rPr>
-            </w:pPr>
+              <w:t>Semester 1</w:t>
+            </w:r>
           </w:p>
         </w:tc>
       </w:tr>
@@ -221,7 +217,7 @@
         </w:trPr>
         <w:tc>
           <w:tcPr>
-            <w:tcW w:w="1260" w:type="dxa"/>
+            <w:tcW w:w="1520" w:type="dxa"/>
             <w:tcBorders>
               <w:top w:val="single" w:sz="8" w:space="0" w:color="auto"/>
             </w:tcBorders>
@@ -251,7 +247,7 @@
         </w:tc>
         <w:tc>
           <w:tcPr>
-            <w:tcW w:w="1170" w:type="dxa"/>
+            <w:tcW w:w="1766" w:type="dxa"/>
             <w:tcBorders>
               <w:top w:val="single" w:sz="8" w:space="0" w:color="auto"/>
             </w:tcBorders>
@@ -281,7 +277,7 @@
         </w:tc>
         <w:tc>
           <w:tcPr>
-            <w:tcW w:w="1260" w:type="dxa"/>
+            <w:tcW w:w="1052" w:type="dxa"/>
             <w:tcBorders>
               <w:top w:val="single" w:sz="8" w:space="0" w:color="auto"/>
             </w:tcBorders>
@@ -376,7 +372,7 @@
         </w:trPr>
         <w:tc>
           <w:tcPr>
-            <w:tcW w:w="1260" w:type="dxa"/>
+            <w:tcW w:w="1520" w:type="dxa"/>
             <w:tcBorders>
               <w:bottom w:val="single" w:sz="8" w:space="0" w:color="auto"/>
             </w:tcBorders>
@@ -402,11 +398,50 @@
               </w:rPr>
               <w:t> </w:t>
             </w:r>
-          </w:p>
-        </w:tc>
-        <w:tc>
-          <w:tcPr>
-            <w:tcW w:w="1170" w:type="dxa"/>
+            <w:r>
+              <w:rPr>
+                <w:rFonts w:eastAsia="Times New Roman"/>
+                <w:color w:val="000000"/>
+                <w:sz w:val="24"/>
+                <w:szCs w:val="24"/>
+              </w:rPr>
+              <w:t>520172U011</w:t>
+            </w:r>
+          </w:p>
+        </w:tc>
+        <w:tc>
+          <w:tcPr>
+            <w:tcW w:w="1766" w:type="dxa"/>
+            <w:tcBorders>
+              <w:bottom w:val="single" w:sz="8" w:space="0" w:color="auto"/>
+            </w:tcBorders>
+            <w:shd w:val="clear" w:color="auto" w:fill="auto"/>
+            <w:vAlign w:val="center"/>
+            <w:hideMark/>
+          </w:tcPr>
+          <w:p>
+            <w:pPr>
+              <w:rPr>
+                <w:rFonts w:eastAsia="Times New Roman"/>
+                <w:color w:val="000000"/>
+                <w:sz w:val="24"/>
+                <w:szCs w:val="24"/>
+              </w:rPr>
+            </w:pPr>
+            <w:r>
+              <w:rPr>
+                <w:rFonts w:eastAsia="Times New Roman"/>
+                <w:color w:val="000000"/>
+                <w:sz w:val="24"/>
+                <w:szCs w:val="24"/>
+              </w:rPr>
+              <w:t>Theory of Algorithms and Computational Complexity</w:t>
+            </w:r>
+          </w:p>
+        </w:tc>
+        <w:tc>
+          <w:tcPr>
+            <w:tcW w:w="1052" w:type="dxa"/>
             <w:tcBorders>
               <w:bottom w:val="single" w:sz="8" w:space="0" w:color="auto"/>
             </w:tcBorders>
@@ -432,35 +467,14 @@
               </w:rPr>
               <w:t> </w:t>
             </w:r>
-          </w:p>
-        </w:tc>
-        <w:tc>
-          <w:tcPr>
-            <w:tcW w:w="1260" w:type="dxa"/>
-            <w:tcBorders>
-              <w:bottom w:val="single" w:sz="8" w:space="0" w:color="auto"/>
-            </w:tcBorders>
-            <w:shd w:val="clear" w:color="auto" w:fill="auto"/>
-            <w:vAlign w:val="center"/>
-            <w:hideMark/>
-          </w:tcPr>
-          <w:p>
-            <w:pPr>
-              <w:rPr>
-                <w:rFonts w:eastAsia="Times New Roman"/>
-                <w:color w:val="000000"/>
-                <w:sz w:val="24"/>
-                <w:szCs w:val="24"/>
-              </w:rPr>
-            </w:pPr>
-            <w:r>
-              <w:rPr>
-                <w:rFonts w:eastAsia="Times New Roman"/>
-                <w:color w:val="000000"/>
-                <w:sz w:val="24"/>
-                <w:szCs w:val="24"/>
-              </w:rPr>
-              <w:t> </w:t>
+            <w:r>
+              <w:rPr>
+                <w:rFonts w:eastAsia="Times New Roman"/>
+                <w:color w:val="000000"/>
+                <w:sz w:val="24"/>
+                <w:szCs w:val="24"/>
+              </w:rPr>
+              <w:t>CS3230</w:t>
             </w:r>
           </w:p>
         </w:tc>
@@ -490,7 +504,7 @@
                 <w:sz w:val="24"/>
                 <w:szCs w:val="24"/>
               </w:rPr>
-              <w:t> </w:t>
+              <w:t>Design and Analysis of Algorithm</w:t>
             </w:r>
           </w:p>
         </w:tc>
@@ -513,35 +527,687 @@
                 <w:szCs w:val="24"/>
               </w:rPr>
             </w:pPr>
-            <w:r>
-              <w:rPr>
-                <w:rFonts w:eastAsia="Times New Roman"/>
-                <w:color w:val="000000"/>
-                <w:sz w:val="24"/>
-                <w:szCs w:val="24"/>
-              </w:rPr>
-              <w:t xml:space="preserve">Please check if this is a restricted course in the partner university. Also, please note that you have to fulfil the prescribe NUS’ </w:t>
-            </w:r>
-            <w:proofErr w:type="gramStart"/>
-            <w:r>
-              <w:rPr>
-                <w:rFonts w:eastAsia="Times New Roman"/>
-                <w:color w:val="000000"/>
-                <w:sz w:val="24"/>
-                <w:szCs w:val="24"/>
-              </w:rPr>
-              <w:t>pre requisites</w:t>
-            </w:r>
-            <w:proofErr w:type="gramEnd"/>
-            <w:r>
-              <w:rPr>
-                <w:rFonts w:eastAsia="Times New Roman"/>
-                <w:color w:val="000000"/>
-                <w:sz w:val="24"/>
-                <w:szCs w:val="24"/>
-              </w:rPr>
-              <w:t xml:space="preserve"> before you read the courses during your exchange. </w:t>
-            </w:r>
+          </w:p>
+        </w:tc>
+      </w:tr>
+      <w:tr>
+        <w:trPr>
+          <w:trHeight w:val="1572"/>
+        </w:trPr>
+        <w:tc>
+          <w:tcPr>
+            <w:tcW w:w="1520" w:type="dxa"/>
+            <w:tcBorders>
+              <w:bottom w:val="single" w:sz="8" w:space="0" w:color="auto"/>
+            </w:tcBorders>
+            <w:shd w:val="clear" w:color="auto" w:fill="auto"/>
+            <w:vAlign w:val="center"/>
+          </w:tcPr>
+          <w:p>
+            <w:pPr>
+              <w:rPr>
+                <w:rFonts w:eastAsia="Times New Roman"/>
+                <w:color w:val="000000"/>
+                <w:sz w:val="24"/>
+                <w:szCs w:val="24"/>
+              </w:rPr>
+            </w:pPr>
+            <w:r>
+              <w:rPr>
+                <w:rFonts w:eastAsia="Times New Roman"/>
+                <w:color w:val="000000"/>
+                <w:sz w:val="24"/>
+                <w:szCs w:val="24"/>
+              </w:rPr>
+              <w:t>520171U007</w:t>
+            </w:r>
+          </w:p>
+        </w:tc>
+        <w:tc>
+          <w:tcPr>
+            <w:tcW w:w="1766" w:type="dxa"/>
+            <w:tcBorders>
+              <w:bottom w:val="single" w:sz="8" w:space="0" w:color="auto"/>
+            </w:tcBorders>
+            <w:shd w:val="clear" w:color="auto" w:fill="auto"/>
+            <w:vAlign w:val="center"/>
+          </w:tcPr>
+          <w:p>
+            <w:pPr>
+              <w:rPr>
+                <w:rFonts w:eastAsia="Times New Roman"/>
+                <w:color w:val="000000"/>
+                <w:sz w:val="24"/>
+                <w:szCs w:val="24"/>
+              </w:rPr>
+            </w:pPr>
+            <w:r>
+              <w:rPr>
+                <w:rFonts w:eastAsia="Times New Roman"/>
+                <w:color w:val="000000"/>
+                <w:sz w:val="24"/>
+                <w:szCs w:val="24"/>
+              </w:rPr>
+              <w:t>Machine Learning</w:t>
+            </w:r>
+          </w:p>
+        </w:tc>
+        <w:tc>
+          <w:tcPr>
+            <w:tcW w:w="1052" w:type="dxa"/>
+            <w:vMerge w:val="restart"/>
+            <w:shd w:val="clear" w:color="auto" w:fill="auto"/>
+            <w:vAlign w:val="center"/>
+          </w:tcPr>
+          <w:p>
+            <w:pPr>
+              <w:rPr>
+                <w:rFonts w:eastAsia="Times New Roman"/>
+                <w:color w:val="000000"/>
+                <w:sz w:val="24"/>
+                <w:szCs w:val="24"/>
+              </w:rPr>
+            </w:pPr>
+            <w:r>
+              <w:rPr>
+                <w:rFonts w:eastAsia="Times New Roman"/>
+                <w:color w:val="000000"/>
+                <w:sz w:val="24"/>
+                <w:szCs w:val="24"/>
+              </w:rPr>
+              <w:t>CS3244</w:t>
+            </w:r>
+          </w:p>
+        </w:tc>
+        <w:tc>
+          <w:tcPr>
+            <w:tcW w:w="2630" w:type="dxa"/>
+            <w:vMerge w:val="restart"/>
+            <w:shd w:val="clear" w:color="auto" w:fill="auto"/>
+            <w:vAlign w:val="center"/>
+          </w:tcPr>
+          <w:p>
+            <w:pPr>
+              <w:rPr>
+                <w:rFonts w:eastAsia="Times New Roman"/>
+                <w:color w:val="000000"/>
+                <w:sz w:val="24"/>
+                <w:szCs w:val="24"/>
+              </w:rPr>
+            </w:pPr>
+            <w:r>
+              <w:rPr>
+                <w:rFonts w:eastAsia="Times New Roman"/>
+                <w:color w:val="000000"/>
+                <w:sz w:val="24"/>
+                <w:szCs w:val="24"/>
+              </w:rPr>
+              <w:t>Machine Learning</w:t>
+            </w:r>
+          </w:p>
+        </w:tc>
+        <w:tc>
+          <w:tcPr>
+            <w:tcW w:w="2950" w:type="dxa"/>
+            <w:vMerge w:val="restart"/>
+            <w:shd w:val="clear" w:color="auto" w:fill="auto"/>
+            <w:vAlign w:val="center"/>
+          </w:tcPr>
+          <w:p>
+            <w:pPr>
+              <w:rPr>
+                <w:rFonts w:eastAsia="Times New Roman"/>
+                <w:color w:val="000000"/>
+                <w:sz w:val="24"/>
+                <w:szCs w:val="24"/>
+              </w:rPr>
+            </w:pPr>
+            <w:r>
+              <w:rPr>
+                <w:rFonts w:eastAsia="Times New Roman"/>
+                <w:color w:val="000000"/>
+                <w:sz w:val="24"/>
+                <w:szCs w:val="24"/>
+              </w:rPr>
+              <w:t xml:space="preserve">One or the other. </w:t>
+            </w:r>
+          </w:p>
+        </w:tc>
+      </w:tr>
+      <w:tr>
+        <w:trPr>
+          <w:trHeight w:val="1572"/>
+        </w:trPr>
+        <w:tc>
+          <w:tcPr>
+            <w:tcW w:w="1520" w:type="dxa"/>
+            <w:tcBorders>
+              <w:bottom w:val="single" w:sz="8" w:space="0" w:color="auto"/>
+            </w:tcBorders>
+            <w:shd w:val="clear" w:color="auto" w:fill="auto"/>
+            <w:vAlign w:val="center"/>
+          </w:tcPr>
+          <w:p>
+            <w:pPr>
+              <w:rPr>
+                <w:rFonts w:eastAsia="Times New Roman"/>
+                <w:color w:val="000000"/>
+                <w:sz w:val="24"/>
+                <w:szCs w:val="24"/>
+              </w:rPr>
+            </w:pPr>
+            <w:r>
+              <w:rPr>
+                <w:rFonts w:eastAsia="Times New Roman"/>
+                <w:color w:val="000000"/>
+                <w:sz w:val="24"/>
+                <w:szCs w:val="24"/>
+              </w:rPr>
+              <w:t>480192U005</w:t>
+            </w:r>
+          </w:p>
+        </w:tc>
+        <w:tc>
+          <w:tcPr>
+            <w:tcW w:w="1766" w:type="dxa"/>
+            <w:tcBorders>
+              <w:bottom w:val="single" w:sz="8" w:space="0" w:color="auto"/>
+            </w:tcBorders>
+            <w:shd w:val="clear" w:color="auto" w:fill="auto"/>
+            <w:vAlign w:val="center"/>
+          </w:tcPr>
+          <w:p>
+            <w:pPr>
+              <w:rPr>
+                <w:rFonts w:eastAsia="Times New Roman"/>
+                <w:color w:val="000000"/>
+                <w:sz w:val="24"/>
+                <w:szCs w:val="24"/>
+              </w:rPr>
+            </w:pPr>
+            <w:r>
+              <w:rPr>
+                <w:rFonts w:eastAsia="Times New Roman"/>
+                <w:color w:val="000000"/>
+                <w:sz w:val="24"/>
+                <w:szCs w:val="24"/>
+              </w:rPr>
+              <w:t>Machine Learning Fundamentals and Applications</w:t>
+            </w:r>
+          </w:p>
+        </w:tc>
+        <w:tc>
+          <w:tcPr>
+            <w:tcW w:w="1052" w:type="dxa"/>
+            <w:vMerge/>
+            <w:tcBorders>
+              <w:bottom w:val="single" w:sz="8" w:space="0" w:color="auto"/>
+            </w:tcBorders>
+            <w:shd w:val="clear" w:color="auto" w:fill="auto"/>
+            <w:vAlign w:val="center"/>
+          </w:tcPr>
+          <w:p>
+            <w:pPr>
+              <w:rPr>
+                <w:rFonts w:eastAsia="Times New Roman"/>
+                <w:color w:val="000000"/>
+                <w:sz w:val="24"/>
+                <w:szCs w:val="24"/>
+              </w:rPr>
+            </w:pPr>
+          </w:p>
+        </w:tc>
+        <w:tc>
+          <w:tcPr>
+            <w:tcW w:w="2630" w:type="dxa"/>
+            <w:vMerge/>
+            <w:tcBorders>
+              <w:bottom w:val="single" w:sz="8" w:space="0" w:color="auto"/>
+            </w:tcBorders>
+            <w:shd w:val="clear" w:color="auto" w:fill="auto"/>
+            <w:vAlign w:val="center"/>
+          </w:tcPr>
+          <w:p>
+            <w:pPr>
+              <w:rPr>
+                <w:rFonts w:eastAsia="Times New Roman"/>
+                <w:color w:val="000000"/>
+                <w:sz w:val="24"/>
+                <w:szCs w:val="24"/>
+              </w:rPr>
+            </w:pPr>
+          </w:p>
+        </w:tc>
+        <w:tc>
+          <w:tcPr>
+            <w:tcW w:w="2950" w:type="dxa"/>
+            <w:vMerge/>
+            <w:tcBorders>
+              <w:bottom w:val="single" w:sz="8" w:space="0" w:color="auto"/>
+            </w:tcBorders>
+            <w:shd w:val="clear" w:color="auto" w:fill="auto"/>
+            <w:vAlign w:val="center"/>
+          </w:tcPr>
+          <w:p>
+            <w:pPr>
+              <w:rPr>
+                <w:rFonts w:eastAsia="Times New Roman"/>
+                <w:color w:val="000000"/>
+                <w:sz w:val="24"/>
+                <w:szCs w:val="24"/>
+              </w:rPr>
+            </w:pPr>
+          </w:p>
+        </w:tc>
+      </w:tr>
+      <w:tr>
+        <w:trPr>
+          <w:trHeight w:val="1572"/>
+        </w:trPr>
+        <w:tc>
+          <w:tcPr>
+            <w:tcW w:w="1520" w:type="dxa"/>
+            <w:tcBorders>
+              <w:bottom w:val="single" w:sz="8" w:space="0" w:color="auto"/>
+            </w:tcBorders>
+            <w:shd w:val="clear" w:color="auto" w:fill="auto"/>
+            <w:vAlign w:val="center"/>
+          </w:tcPr>
+          <w:p>
+            <w:pPr>
+              <w:rPr>
+                <w:rFonts w:eastAsia="Times New Roman"/>
+                <w:color w:val="000000"/>
+                <w:sz w:val="24"/>
+                <w:szCs w:val="24"/>
+              </w:rPr>
+            </w:pPr>
+            <w:r>
+              <w:rPr>
+                <w:rFonts w:eastAsia="Times New Roman"/>
+                <w:color w:val="000000"/>
+                <w:sz w:val="24"/>
+                <w:szCs w:val="24"/>
+              </w:rPr>
+              <w:t>520171U009</w:t>
+            </w:r>
+          </w:p>
+        </w:tc>
+        <w:tc>
+          <w:tcPr>
+            <w:tcW w:w="1766" w:type="dxa"/>
+            <w:tcBorders>
+              <w:bottom w:val="single" w:sz="8" w:space="0" w:color="auto"/>
+            </w:tcBorders>
+            <w:shd w:val="clear" w:color="auto" w:fill="auto"/>
+            <w:vAlign w:val="center"/>
+          </w:tcPr>
+          <w:p>
+            <w:pPr>
+              <w:rPr>
+                <w:rFonts w:eastAsia="Times New Roman"/>
+                <w:color w:val="000000"/>
+                <w:sz w:val="24"/>
+                <w:szCs w:val="24"/>
+              </w:rPr>
+            </w:pPr>
+            <w:r>
+              <w:rPr>
+                <w:rFonts w:eastAsia="Times New Roman"/>
+                <w:color w:val="000000"/>
+                <w:sz w:val="24"/>
+                <w:szCs w:val="24"/>
+              </w:rPr>
+              <w:t>Software Engineering and Architecture</w:t>
+            </w:r>
+          </w:p>
+        </w:tc>
+        <w:tc>
+          <w:tcPr>
+            <w:tcW w:w="1052" w:type="dxa"/>
+            <w:vMerge w:val="restart"/>
+            <w:shd w:val="clear" w:color="auto" w:fill="auto"/>
+            <w:vAlign w:val="center"/>
+          </w:tcPr>
+          <w:p>
+            <w:pPr>
+              <w:rPr>
+                <w:rFonts w:eastAsia="Times New Roman"/>
+                <w:color w:val="000000"/>
+                <w:sz w:val="24"/>
+                <w:szCs w:val="24"/>
+              </w:rPr>
+            </w:pPr>
+            <w:r>
+              <w:rPr>
+                <w:rFonts w:eastAsia="Times New Roman"/>
+                <w:color w:val="000000"/>
+                <w:sz w:val="24"/>
+                <w:szCs w:val="24"/>
+              </w:rPr>
+              <w:t>CS3219</w:t>
+            </w:r>
+          </w:p>
+        </w:tc>
+        <w:tc>
+          <w:tcPr>
+            <w:tcW w:w="2630" w:type="dxa"/>
+            <w:vMerge w:val="restart"/>
+            <w:shd w:val="clear" w:color="auto" w:fill="auto"/>
+            <w:vAlign w:val="center"/>
+          </w:tcPr>
+          <w:p>
+            <w:pPr>
+              <w:rPr>
+                <w:rFonts w:eastAsia="Times New Roman"/>
+                <w:color w:val="000000"/>
+                <w:sz w:val="24"/>
+                <w:szCs w:val="24"/>
+              </w:rPr>
+            </w:pPr>
+            <w:r>
+              <w:rPr>
+                <w:rFonts w:eastAsia="Times New Roman"/>
+                <w:color w:val="000000"/>
+                <w:sz w:val="24"/>
+                <w:szCs w:val="24"/>
+              </w:rPr>
+              <w:t xml:space="preserve">Software Engineering Principle </w:t>
+            </w:r>
+          </w:p>
+        </w:tc>
+        <w:tc>
+          <w:tcPr>
+            <w:tcW w:w="2950" w:type="dxa"/>
+            <w:vMerge w:val="restart"/>
+            <w:shd w:val="clear" w:color="auto" w:fill="auto"/>
+            <w:vAlign w:val="center"/>
+          </w:tcPr>
+          <w:p>
+            <w:pPr>
+              <w:rPr>
+                <w:rFonts w:eastAsia="Times New Roman"/>
+                <w:color w:val="000000"/>
+                <w:sz w:val="24"/>
+                <w:szCs w:val="24"/>
+              </w:rPr>
+            </w:pPr>
+            <w:r>
+              <w:rPr>
+                <w:rFonts w:eastAsia="Times New Roman"/>
+                <w:color w:val="000000"/>
+                <w:sz w:val="24"/>
+                <w:szCs w:val="24"/>
+              </w:rPr>
+              <w:t xml:space="preserve">One or the other. </w:t>
+            </w:r>
+          </w:p>
+        </w:tc>
+      </w:tr>
+      <w:tr>
+        <w:trPr>
+          <w:trHeight w:val="1572"/>
+        </w:trPr>
+        <w:tc>
+          <w:tcPr>
+            <w:tcW w:w="1520" w:type="dxa"/>
+            <w:tcBorders>
+              <w:bottom w:val="single" w:sz="8" w:space="0" w:color="auto"/>
+            </w:tcBorders>
+            <w:shd w:val="clear" w:color="auto" w:fill="auto"/>
+            <w:vAlign w:val="center"/>
+          </w:tcPr>
+          <w:p>
+            <w:pPr>
+              <w:rPr>
+                <w:rFonts w:eastAsia="Times New Roman"/>
+                <w:color w:val="000000"/>
+                <w:sz w:val="24"/>
+                <w:szCs w:val="24"/>
+              </w:rPr>
+            </w:pPr>
+            <w:r>
+              <w:rPr>
+                <w:rFonts w:eastAsia="Times New Roman"/>
+                <w:color w:val="000000"/>
+                <w:sz w:val="24"/>
+                <w:szCs w:val="24"/>
+              </w:rPr>
+              <w:t>520241U011</w:t>
+            </w:r>
+          </w:p>
+        </w:tc>
+        <w:tc>
+          <w:tcPr>
+            <w:tcW w:w="1766" w:type="dxa"/>
+            <w:tcBorders>
+              <w:bottom w:val="single" w:sz="8" w:space="0" w:color="auto"/>
+            </w:tcBorders>
+            <w:shd w:val="clear" w:color="auto" w:fill="auto"/>
+            <w:vAlign w:val="center"/>
+          </w:tcPr>
+          <w:p>
+            <w:pPr>
+              <w:rPr>
+                <w:rFonts w:eastAsia="Times New Roman"/>
+                <w:color w:val="000000"/>
+                <w:sz w:val="24"/>
+                <w:szCs w:val="24"/>
+              </w:rPr>
+            </w:pPr>
+            <w:r>
+              <w:rPr>
+                <w:rFonts w:eastAsia="Times New Roman"/>
+                <w:color w:val="000000"/>
+                <w:sz w:val="24"/>
+                <w:szCs w:val="24"/>
+              </w:rPr>
+              <w:t>Software Engineering and Architecture</w:t>
+            </w:r>
+          </w:p>
+        </w:tc>
+        <w:tc>
+          <w:tcPr>
+            <w:tcW w:w="1052" w:type="dxa"/>
+            <w:vMerge/>
+            <w:tcBorders>
+              <w:bottom w:val="single" w:sz="8" w:space="0" w:color="auto"/>
+            </w:tcBorders>
+            <w:shd w:val="clear" w:color="auto" w:fill="auto"/>
+            <w:vAlign w:val="center"/>
+          </w:tcPr>
+          <w:p>
+            <w:pPr>
+              <w:rPr>
+                <w:rFonts w:eastAsia="Times New Roman"/>
+                <w:color w:val="000000"/>
+                <w:sz w:val="24"/>
+                <w:szCs w:val="24"/>
+              </w:rPr>
+            </w:pPr>
+          </w:p>
+        </w:tc>
+        <w:tc>
+          <w:tcPr>
+            <w:tcW w:w="2630" w:type="dxa"/>
+            <w:vMerge/>
+            <w:tcBorders>
+              <w:bottom w:val="single" w:sz="8" w:space="0" w:color="auto"/>
+            </w:tcBorders>
+            <w:shd w:val="clear" w:color="auto" w:fill="auto"/>
+            <w:vAlign w:val="center"/>
+          </w:tcPr>
+          <w:p>
+            <w:pPr>
+              <w:rPr>
+                <w:rFonts w:eastAsia="Times New Roman"/>
+                <w:color w:val="000000"/>
+                <w:sz w:val="24"/>
+                <w:szCs w:val="24"/>
+              </w:rPr>
+            </w:pPr>
+          </w:p>
+        </w:tc>
+        <w:tc>
+          <w:tcPr>
+            <w:tcW w:w="2950" w:type="dxa"/>
+            <w:vMerge/>
+            <w:tcBorders>
+              <w:bottom w:val="single" w:sz="8" w:space="0" w:color="auto"/>
+            </w:tcBorders>
+            <w:shd w:val="clear" w:color="auto" w:fill="auto"/>
+            <w:vAlign w:val="center"/>
+          </w:tcPr>
+          <w:p>
+            <w:pPr>
+              <w:rPr>
+                <w:rFonts w:eastAsia="Times New Roman"/>
+                <w:color w:val="000000"/>
+                <w:sz w:val="24"/>
+                <w:szCs w:val="24"/>
+              </w:rPr>
+            </w:pPr>
+          </w:p>
+        </w:tc>
+      </w:tr>
+      <w:tr>
+        <w:trPr>
+          <w:trHeight w:val="1572"/>
+        </w:trPr>
+        <w:tc>
+          <w:tcPr>
+            <w:tcW w:w="1520" w:type="dxa"/>
+            <w:tcBorders>
+              <w:bottom w:val="single" w:sz="8" w:space="0" w:color="auto"/>
+            </w:tcBorders>
+            <w:shd w:val="clear" w:color="auto" w:fill="auto"/>
+            <w:vAlign w:val="center"/>
+          </w:tcPr>
+          <w:p>
+            <w:pPr>
+              <w:rPr>
+                <w:rFonts w:eastAsia="Times New Roman"/>
+                <w:color w:val="000000"/>
+                <w:sz w:val="24"/>
+                <w:szCs w:val="24"/>
+              </w:rPr>
+            </w:pPr>
+            <w:r>
+              <w:rPr>
+                <w:rFonts w:eastAsia="Times New Roman"/>
+                <w:color w:val="000000"/>
+                <w:sz w:val="24"/>
+                <w:szCs w:val="24"/>
+              </w:rPr>
+              <w:t>520171U013</w:t>
+            </w:r>
+          </w:p>
+        </w:tc>
+        <w:tc>
+          <w:tcPr>
+            <w:tcW w:w="1766" w:type="dxa"/>
+            <w:tcBorders>
+              <w:bottom w:val="single" w:sz="8" w:space="0" w:color="auto"/>
+            </w:tcBorders>
+            <w:shd w:val="clear" w:color="auto" w:fill="auto"/>
+            <w:vAlign w:val="center"/>
+          </w:tcPr>
+          <w:p>
+            <w:pPr>
+              <w:rPr>
+                <w:rFonts w:eastAsia="Times New Roman"/>
+                <w:color w:val="000000"/>
+                <w:sz w:val="24"/>
+                <w:szCs w:val="24"/>
+              </w:rPr>
+            </w:pPr>
+            <w:r>
+              <w:rPr>
+                <w:rFonts w:eastAsia="Times New Roman"/>
+                <w:color w:val="000000"/>
+                <w:sz w:val="24"/>
+                <w:szCs w:val="24"/>
+              </w:rPr>
+              <w:t>The Web of Things</w:t>
+            </w:r>
+          </w:p>
+        </w:tc>
+        <w:tc>
+          <w:tcPr>
+            <w:tcW w:w="1052" w:type="dxa"/>
+            <w:tcBorders>
+              <w:bottom w:val="single" w:sz="8" w:space="0" w:color="auto"/>
+            </w:tcBorders>
+            <w:shd w:val="clear" w:color="auto" w:fill="auto"/>
+            <w:vAlign w:val="center"/>
+          </w:tcPr>
+          <w:p>
+            <w:pPr>
+              <w:rPr>
+                <w:rFonts w:eastAsia="Times New Roman"/>
+                <w:color w:val="000000"/>
+                <w:sz w:val="24"/>
+                <w:szCs w:val="24"/>
+              </w:rPr>
+            </w:pPr>
+            <w:r>
+              <w:rPr>
+                <w:rFonts w:eastAsia="Times New Roman"/>
+                <w:color w:val="000000"/>
+                <w:sz w:val="24"/>
+                <w:szCs w:val="24"/>
+              </w:rPr>
+              <w:t>CS3226</w:t>
+            </w:r>
+          </w:p>
+        </w:tc>
+        <w:tc>
+          <w:tcPr>
+            <w:tcW w:w="2630" w:type="dxa"/>
+            <w:tcBorders>
+              <w:bottom w:val="single" w:sz="8" w:space="0" w:color="auto"/>
+            </w:tcBorders>
+            <w:shd w:val="clear" w:color="auto" w:fill="auto"/>
+            <w:vAlign w:val="center"/>
+          </w:tcPr>
+          <w:p>
+            <w:pPr>
+              <w:rPr>
+                <w:rFonts w:eastAsia="Times New Roman"/>
+                <w:color w:val="000000"/>
+                <w:sz w:val="24"/>
+                <w:szCs w:val="24"/>
+              </w:rPr>
+            </w:pPr>
+            <w:r>
+              <w:rPr>
+                <w:rFonts w:eastAsia="Times New Roman"/>
+                <w:color w:val="000000"/>
+                <w:sz w:val="24"/>
+                <w:szCs w:val="24"/>
+              </w:rPr>
+              <w:t>Web Programming and Applications</w:t>
+            </w:r>
+          </w:p>
+        </w:tc>
+        <w:tc>
+          <w:tcPr>
+            <w:tcW w:w="2950" w:type="dxa"/>
+            <w:tcBorders>
+              <w:bottom w:val="single" w:sz="8" w:space="0" w:color="auto"/>
+            </w:tcBorders>
+            <w:shd w:val="clear" w:color="auto" w:fill="auto"/>
+            <w:vAlign w:val="center"/>
+          </w:tcPr>
+          <w:p>
+            <w:pPr>
+              <w:rPr>
+                <w:rFonts w:eastAsia="Times New Roman"/>
+                <w:color w:val="000000"/>
+                <w:sz w:val="24"/>
+                <w:szCs w:val="24"/>
+              </w:rPr>
+            </w:pPr>
           </w:p>
         </w:tc>
       </w:tr>
@@ -551,8 +1217,8 @@
         </w:trPr>
         <w:tc>
           <w:tcPr>
-            <w:tcW w:w="3690" w:type="dxa"/>
-            <w:gridSpan w:val="3"/>
+            <w:tcW w:w="9918" w:type="dxa"/>
+            <w:gridSpan w:val="5"/>
             <w:tcBorders>
               <w:top w:val="single" w:sz="8" w:space="0" w:color="auto"/>
               <w:left w:val="nil"/>
@@ -574,76 +1240,6 @@
               </w:rPr>
             </w:pPr>
           </w:p>
-          <w:p>
-            <w:pPr>
-              <w:rPr>
-                <w:rFonts w:eastAsia="Times New Roman"/>
-                <w:b/>
-                <w:bCs/>
-                <w:color w:val="000000"/>
-              </w:rPr>
-            </w:pPr>
-            <w:r>
-              <w:rPr>
-                <w:rFonts w:eastAsia="Times New Roman"/>
-                <w:b/>
-                <w:bCs/>
-                <w:color w:val="000000"/>
-              </w:rPr>
-              <w:t xml:space="preserve">2nd choice - ABC University </w:t>
-            </w:r>
-            <w:r>
-              <w:rPr>
-                <w:rFonts w:eastAsia="Times New Roman"/>
-                <w:b/>
-                <w:bCs/>
-                <w:color w:val="000000"/>
-              </w:rPr>
-              <w:br/>
-            </w:r>
-            <w:r>
-              <w:rPr>
-                <w:rFonts w:eastAsia="Times New Roman"/>
-                <w:b/>
-                <w:bCs/>
-                <w:color w:val="000000"/>
-              </w:rPr>
-              <w:t>Indicate Exchange</w:t>
-            </w:r>
-            <w:r>
-              <w:rPr>
-                <w:rFonts w:eastAsia="Times New Roman"/>
-                <w:b/>
-                <w:bCs/>
-                <w:color w:val="000000"/>
-              </w:rPr>
-              <w:t xml:space="preserve"> S</w:t>
-            </w:r>
-            <w:r>
-              <w:rPr>
-                <w:rFonts w:eastAsia="Times New Roman"/>
-                <w:b/>
-                <w:bCs/>
-                <w:color w:val="000000"/>
-              </w:rPr>
-              <w:t>emester</w:t>
-            </w:r>
-          </w:p>
-        </w:tc>
-        <w:tc>
-          <w:tcPr>
-            <w:tcW w:w="2630" w:type="dxa"/>
-            <w:tcBorders>
-              <w:top w:val="single" w:sz="8" w:space="0" w:color="auto"/>
-              <w:left w:val="nil"/>
-              <w:bottom w:val="single" w:sz="8" w:space="0" w:color="auto"/>
-              <w:right w:val="nil"/>
-            </w:tcBorders>
-            <w:shd w:val="clear" w:color="auto" w:fill="auto"/>
-            <w:noWrap/>
-            <w:vAlign w:val="bottom"/>
-            <w:hideMark/>
-          </w:tcPr>
           <w:p>
             <w:pPr>
               <w:rPr>
@@ -652,30 +1248,61 @@
                 <w:szCs w:val="20"/>
               </w:rPr>
             </w:pPr>
-          </w:p>
-        </w:tc>
-        <w:tc>
-          <w:tcPr>
-            <w:tcW w:w="2950" w:type="dxa"/>
-            <w:tcBorders>
-              <w:top w:val="single" w:sz="8" w:space="0" w:color="auto"/>
-              <w:left w:val="nil"/>
-              <w:bottom w:val="single" w:sz="8" w:space="0" w:color="auto"/>
-              <w:right w:val="nil"/>
-            </w:tcBorders>
-            <w:shd w:val="clear" w:color="auto" w:fill="auto"/>
-            <w:noWrap/>
-            <w:vAlign w:val="bottom"/>
-            <w:hideMark/>
-          </w:tcPr>
-          <w:p>
-            <w:pPr>
-              <w:rPr>
-                <w:rFonts w:ascii="Times New Roman" w:eastAsia="Times New Roman" w:hAnsi="Times New Roman" w:cs="Times New Roman"/>
-                <w:sz w:val="20"/>
-                <w:szCs w:val="20"/>
-              </w:rPr>
-            </w:pPr>
+            <w:r>
+              <w:rPr>
+                <w:rFonts w:eastAsia="Times New Roman"/>
+                <w:b/>
+                <w:bCs/>
+                <w:color w:val="000000"/>
+              </w:rPr>
+              <w:t xml:space="preserve">2nd choice - </w:t>
+            </w:r>
+            <w:r>
+              <w:rPr>
+                <w:rFonts w:eastAsia="Times New Roman"/>
+                <w:color w:val="000000"/>
+              </w:rPr>
+              <w:t>E0000000569</w:t>
+            </w:r>
+            <w:r>
+              <w:rPr>
+                <w:rFonts w:eastAsia="Times New Roman"/>
+                <w:b/>
+                <w:bCs/>
+                <w:color w:val="000000"/>
+              </w:rPr>
+              <w:t xml:space="preserve"> </w:t>
+            </w:r>
+            <w:r>
+              <w:rPr>
+                <w:rFonts w:eastAsia="Times New Roman"/>
+                <w:color w:val="000000"/>
+              </w:rPr>
+              <w:t>Uppsala University</w:t>
+            </w:r>
+            <w:r>
+              <w:rPr>
+                <w:rFonts w:eastAsia="Times New Roman"/>
+                <w:b/>
+                <w:bCs/>
+                <w:color w:val="000000"/>
+              </w:rPr>
+              <w:br/>
+            </w:r>
+            <w:r>
+              <w:rPr>
+                <w:rFonts w:eastAsia="Times New Roman"/>
+                <w:color w:val="000000"/>
+              </w:rPr>
+              <w:t xml:space="preserve">Semester </w:t>
+            </w:r>
+            <w:r>
+              <w:rPr>
+                <w:rFonts w:eastAsia="Times New Roman"/>
+                <w:color w:val="000000"/>
+              </w:rPr>
+              <w:t>1</w:t>
+            </w:r>
           </w:p>
         </w:tc>
       </w:tr>
@@ -685,7 +1312,7 @@
         </w:trPr>
         <w:tc>
           <w:tcPr>
-            <w:tcW w:w="1260" w:type="dxa"/>
+            <w:tcW w:w="1520" w:type="dxa"/>
             <w:tcBorders>
               <w:top w:val="single" w:sz="8" w:space="0" w:color="auto"/>
             </w:tcBorders>
@@ -715,7 +1342,7 @@
         </w:tc>
         <w:tc>
           <w:tcPr>
-            <w:tcW w:w="1170" w:type="dxa"/>
+            <w:tcW w:w="1766" w:type="dxa"/>
             <w:tcBorders>
               <w:top w:val="single" w:sz="8" w:space="0" w:color="auto"/>
             </w:tcBorders>
@@ -745,7 +1372,7 @@
         </w:tc>
         <w:tc>
           <w:tcPr>
-            <w:tcW w:w="1260" w:type="dxa"/>
+            <w:tcW w:w="1052" w:type="dxa"/>
             <w:tcBorders>
               <w:top w:val="single" w:sz="8" w:space="0" w:color="auto"/>
             </w:tcBorders>
@@ -840,91 +1467,89 @@
         </w:trPr>
         <w:tc>
           <w:tcPr>
-            <w:tcW w:w="1260" w:type="dxa"/>
-            <w:tcBorders>
-              <w:bottom w:val="single" w:sz="8" w:space="0" w:color="auto"/>
-            </w:tcBorders>
-            <w:shd w:val="clear" w:color="auto" w:fill="auto"/>
-            <w:vAlign w:val="center"/>
-            <w:hideMark/>
-          </w:tcPr>
-          <w:p>
-            <w:pPr>
-              <w:rPr>
-                <w:rFonts w:eastAsia="Times New Roman"/>
-                <w:color w:val="000000"/>
-                <w:sz w:val="24"/>
-                <w:szCs w:val="24"/>
-              </w:rPr>
-            </w:pPr>
-            <w:r>
-              <w:rPr>
-                <w:rFonts w:eastAsia="Times New Roman"/>
-                <w:color w:val="000000"/>
-                <w:sz w:val="24"/>
-                <w:szCs w:val="24"/>
-              </w:rPr>
-              <w:t> </w:t>
-            </w:r>
-          </w:p>
-        </w:tc>
-        <w:tc>
-          <w:tcPr>
-            <w:tcW w:w="1170" w:type="dxa"/>
-            <w:tcBorders>
-              <w:bottom w:val="single" w:sz="8" w:space="0" w:color="auto"/>
-            </w:tcBorders>
-            <w:shd w:val="clear" w:color="auto" w:fill="auto"/>
-            <w:vAlign w:val="center"/>
-            <w:hideMark/>
-          </w:tcPr>
-          <w:p>
-            <w:pPr>
-              <w:rPr>
-                <w:rFonts w:eastAsia="Times New Roman"/>
-                <w:color w:val="000000"/>
-                <w:sz w:val="24"/>
-                <w:szCs w:val="24"/>
-              </w:rPr>
-            </w:pPr>
-            <w:r>
-              <w:rPr>
-                <w:rFonts w:eastAsia="Times New Roman"/>
-                <w:color w:val="000000"/>
-                <w:sz w:val="24"/>
-                <w:szCs w:val="24"/>
-              </w:rPr>
-              <w:t> </w:t>
-            </w:r>
-          </w:p>
-        </w:tc>
-        <w:tc>
-          <w:tcPr>
-            <w:tcW w:w="1260" w:type="dxa"/>
-            <w:tcBorders>
-              <w:bottom w:val="single" w:sz="8" w:space="0" w:color="auto"/>
-            </w:tcBorders>
-            <w:shd w:val="clear" w:color="auto" w:fill="auto"/>
-            <w:vAlign w:val="center"/>
-            <w:hideMark/>
-          </w:tcPr>
-          <w:p>
-            <w:pPr>
-              <w:rPr>
-                <w:rFonts w:eastAsia="Times New Roman"/>
-                <w:color w:val="000000"/>
-                <w:sz w:val="24"/>
-                <w:szCs w:val="24"/>
-              </w:rPr>
-            </w:pPr>
-            <w:r>
-              <w:rPr>
-                <w:rFonts w:eastAsia="Times New Roman"/>
-                <w:color w:val="000000"/>
-                <w:sz w:val="24"/>
-                <w:szCs w:val="24"/>
-              </w:rPr>
-              <w:t> </w:t>
+            <w:tcW w:w="1520" w:type="dxa"/>
+            <w:tcBorders>
+              <w:bottom w:val="single" w:sz="8" w:space="0" w:color="auto"/>
+            </w:tcBorders>
+            <w:shd w:val="clear" w:color="auto" w:fill="auto"/>
+            <w:vAlign w:val="center"/>
+          </w:tcPr>
+          <w:p>
+            <w:pPr>
+              <w:rPr>
+                <w:rFonts w:eastAsia="Times New Roman"/>
+                <w:color w:val="000000"/>
+                <w:sz w:val="24"/>
+                <w:szCs w:val="24"/>
+              </w:rPr>
+            </w:pPr>
+            <w:r>
+              <w:rPr>
+                <w:rFonts w:eastAsia="Times New Roman"/>
+                <w:color w:val="000000"/>
+                <w:sz w:val="24"/>
+                <w:szCs w:val="24"/>
+              </w:rPr>
+              <w:lastRenderedPageBreak/>
+              <w:t>1DL242</w:t>
+            </w:r>
+          </w:p>
+        </w:tc>
+        <w:tc>
+          <w:tcPr>
+            <w:tcW w:w="1766" w:type="dxa"/>
+            <w:tcBorders>
+              <w:bottom w:val="single" w:sz="8" w:space="0" w:color="auto"/>
+            </w:tcBorders>
+            <w:shd w:val="clear" w:color="auto" w:fill="auto"/>
+            <w:vAlign w:val="center"/>
+          </w:tcPr>
+          <w:p>
+            <w:pPr>
+              <w:rPr>
+                <w:rFonts w:eastAsia="Times New Roman"/>
+                <w:color w:val="000000"/>
+                <w:sz w:val="24"/>
+                <w:szCs w:val="24"/>
+              </w:rPr>
+            </w:pPr>
+            <w:r>
+              <w:rPr>
+                <w:rFonts w:eastAsia="Times New Roman"/>
+                <w:color w:val="000000"/>
+                <w:sz w:val="24"/>
+                <w:szCs w:val="24"/>
+              </w:rPr>
+              <w:t>Advanced Software Design</w:t>
+            </w:r>
+          </w:p>
+        </w:tc>
+        <w:tc>
+          <w:tcPr>
+            <w:tcW w:w="1052" w:type="dxa"/>
+            <w:tcBorders>
+              <w:bottom w:val="single" w:sz="8" w:space="0" w:color="auto"/>
+            </w:tcBorders>
+            <w:shd w:val="clear" w:color="auto" w:fill="auto"/>
+            <w:vAlign w:val="center"/>
+          </w:tcPr>
+          <w:p>
+            <w:pPr>
+              <w:rPr>
+                <w:rFonts w:eastAsia="Times New Roman"/>
+                <w:color w:val="000000"/>
+                <w:sz w:val="24"/>
+                <w:szCs w:val="24"/>
+              </w:rPr>
+            </w:pPr>
+            <w:r>
+              <w:rPr>
+                <w:rFonts w:eastAsia="Times New Roman"/>
+                <w:color w:val="000000"/>
+                <w:sz w:val="24"/>
+                <w:szCs w:val="24"/>
+              </w:rPr>
+              <w:t>CS3219</w:t>
             </w:r>
           </w:p>
         </w:tc>
@@ -936,25 +1561,24 @@
             </w:tcBorders>
             <w:shd w:val="clear" w:color="auto" w:fill="auto"/>
             <w:vAlign w:val="center"/>
-            <w:hideMark/>
-          </w:tcPr>
-          <w:p>
-            <w:pPr>
-              <w:rPr>
-                <w:rFonts w:eastAsia="Times New Roman"/>
-                <w:color w:val="000000"/>
-                <w:sz w:val="24"/>
-                <w:szCs w:val="24"/>
-              </w:rPr>
-            </w:pPr>
-            <w:r>
-              <w:rPr>
-                <w:rFonts w:eastAsia="Times New Roman"/>
-                <w:color w:val="000000"/>
-                <w:sz w:val="24"/>
-                <w:szCs w:val="24"/>
-              </w:rPr>
-              <w:t> </w:t>
+          </w:tcPr>
+          <w:p>
+            <w:pPr>
+              <w:rPr>
+                <w:rFonts w:eastAsia="Times New Roman"/>
+                <w:color w:val="000000"/>
+                <w:sz w:val="24"/>
+                <w:szCs w:val="24"/>
+              </w:rPr>
+            </w:pPr>
+            <w:r>
+              <w:rPr>
+                <w:rFonts w:eastAsia="Times New Roman"/>
+                <w:color w:val="000000"/>
+                <w:sz w:val="24"/>
+                <w:szCs w:val="24"/>
+              </w:rPr>
+              <w:t>Software Engineering Principle</w:t>
             </w:r>
           </w:p>
         </w:tc>
@@ -966,45 +1590,1042 @@
             </w:tcBorders>
             <w:shd w:val="clear" w:color="auto" w:fill="auto"/>
             <w:vAlign w:val="center"/>
-            <w:hideMark/>
-          </w:tcPr>
-          <w:p>
-            <w:pPr>
-              <w:rPr>
-                <w:rFonts w:eastAsia="Times New Roman"/>
-                <w:color w:val="000000"/>
-                <w:sz w:val="24"/>
-                <w:szCs w:val="24"/>
-              </w:rPr>
-            </w:pPr>
-            <w:r>
-              <w:rPr>
-                <w:rFonts w:eastAsia="Times New Roman"/>
-                <w:color w:val="000000"/>
-                <w:sz w:val="24"/>
-                <w:szCs w:val="24"/>
-              </w:rPr>
-              <w:t xml:space="preserve">Please check if this is a restricted course in the partner university. Also, please note that you have to fulfil the prescribe NUS’ </w:t>
-            </w:r>
-            <w:proofErr w:type="gramStart"/>
-            <w:r>
-              <w:rPr>
-                <w:rFonts w:eastAsia="Times New Roman"/>
-                <w:color w:val="000000"/>
-                <w:sz w:val="24"/>
-                <w:szCs w:val="24"/>
-              </w:rPr>
-              <w:t>pre requisites</w:t>
-            </w:r>
-            <w:proofErr w:type="gramEnd"/>
-            <w:r>
-              <w:rPr>
-                <w:rFonts w:eastAsia="Times New Roman"/>
-                <w:color w:val="000000"/>
-                <w:sz w:val="24"/>
-                <w:szCs w:val="24"/>
-              </w:rPr>
-              <w:t xml:space="preserve"> before you read the courses during your exchange. </w:t>
+          </w:tcPr>
+          <w:p>
+            <w:pPr>
+              <w:rPr>
+                <w:rFonts w:eastAsia="Times New Roman"/>
+                <w:color w:val="000000"/>
+                <w:sz w:val="24"/>
+                <w:szCs w:val="24"/>
+              </w:rPr>
+            </w:pPr>
+          </w:p>
+        </w:tc>
+      </w:tr>
+      <w:tr>
+        <w:trPr>
+          <w:trHeight w:val="1572"/>
+        </w:trPr>
+        <w:tc>
+          <w:tcPr>
+            <w:tcW w:w="1520" w:type="dxa"/>
+            <w:tcBorders>
+              <w:bottom w:val="single" w:sz="8" w:space="0" w:color="auto"/>
+            </w:tcBorders>
+            <w:shd w:val="clear" w:color="auto" w:fill="auto"/>
+            <w:vAlign w:val="center"/>
+          </w:tcPr>
+          <w:p>
+            <w:pPr>
+              <w:rPr>
+                <w:rFonts w:eastAsia="Times New Roman"/>
+                <w:color w:val="000000"/>
+                <w:sz w:val="24"/>
+                <w:szCs w:val="24"/>
+              </w:rPr>
+            </w:pPr>
+            <w:r>
+              <w:rPr>
+                <w:rFonts w:eastAsia="Times New Roman"/>
+                <w:color w:val="000000"/>
+                <w:sz w:val="24"/>
+                <w:szCs w:val="24"/>
+              </w:rPr>
+              <w:t>1DL340</w:t>
+            </w:r>
+          </w:p>
+        </w:tc>
+        <w:tc>
+          <w:tcPr>
+            <w:tcW w:w="1766" w:type="dxa"/>
+            <w:tcBorders>
+              <w:bottom w:val="single" w:sz="8" w:space="0" w:color="auto"/>
+            </w:tcBorders>
+            <w:shd w:val="clear" w:color="auto" w:fill="auto"/>
+            <w:vAlign w:val="center"/>
+          </w:tcPr>
+          <w:p>
+            <w:pPr>
+              <w:rPr>
+                <w:rFonts w:eastAsia="Times New Roman"/>
+                <w:color w:val="000000"/>
+                <w:sz w:val="24"/>
+                <w:szCs w:val="24"/>
+              </w:rPr>
+            </w:pPr>
+            <w:r>
+              <w:rPr>
+                <w:rFonts w:eastAsia="Times New Roman"/>
+                <w:color w:val="000000"/>
+                <w:sz w:val="24"/>
+                <w:szCs w:val="24"/>
+              </w:rPr>
+              <w:t>Artificial Intelligence</w:t>
+            </w:r>
+          </w:p>
+        </w:tc>
+        <w:tc>
+          <w:tcPr>
+            <w:tcW w:w="1052" w:type="dxa"/>
+            <w:vMerge w:val="restart"/>
+            <w:shd w:val="clear" w:color="auto" w:fill="auto"/>
+            <w:vAlign w:val="center"/>
+          </w:tcPr>
+          <w:p>
+            <w:pPr>
+              <w:rPr>
+                <w:rFonts w:eastAsia="Times New Roman"/>
+                <w:color w:val="000000"/>
+                <w:sz w:val="24"/>
+                <w:szCs w:val="24"/>
+              </w:rPr>
+            </w:pPr>
+            <w:r>
+              <w:rPr>
+                <w:rFonts w:eastAsia="Times New Roman"/>
+                <w:color w:val="000000"/>
+                <w:sz w:val="24"/>
+                <w:szCs w:val="24"/>
+              </w:rPr>
+              <w:t>CS2109S</w:t>
+            </w:r>
+          </w:p>
+        </w:tc>
+        <w:tc>
+          <w:tcPr>
+            <w:tcW w:w="2630" w:type="dxa"/>
+            <w:vMerge w:val="restart"/>
+            <w:shd w:val="clear" w:color="auto" w:fill="auto"/>
+            <w:vAlign w:val="center"/>
+          </w:tcPr>
+          <w:p>
+            <w:pPr>
+              <w:rPr>
+                <w:rFonts w:eastAsia="Times New Roman"/>
+                <w:color w:val="000000"/>
+                <w:sz w:val="24"/>
+                <w:szCs w:val="24"/>
+              </w:rPr>
+            </w:pPr>
+            <w:r>
+              <w:rPr>
+                <w:rFonts w:eastAsia="Times New Roman"/>
+                <w:color w:val="000000"/>
+                <w:sz w:val="24"/>
+                <w:szCs w:val="24"/>
+              </w:rPr>
+              <w:t xml:space="preserve">Introduction to AI and Machine Learning </w:t>
+            </w:r>
+          </w:p>
+        </w:tc>
+        <w:tc>
+          <w:tcPr>
+            <w:tcW w:w="2950" w:type="dxa"/>
+            <w:vMerge w:val="restart"/>
+            <w:shd w:val="clear" w:color="auto" w:fill="auto"/>
+            <w:vAlign w:val="center"/>
+          </w:tcPr>
+          <w:p>
+            <w:pPr>
+              <w:rPr>
+                <w:rFonts w:eastAsia="Times New Roman"/>
+                <w:color w:val="000000"/>
+                <w:sz w:val="24"/>
+                <w:szCs w:val="24"/>
+              </w:rPr>
+            </w:pPr>
+            <w:r>
+              <w:rPr>
+                <w:rFonts w:eastAsia="Times New Roman"/>
+                <w:color w:val="000000"/>
+                <w:sz w:val="24"/>
+                <w:szCs w:val="24"/>
+              </w:rPr>
+              <w:t>One or the other.</w:t>
+            </w:r>
+          </w:p>
+        </w:tc>
+      </w:tr>
+      <w:tr>
+        <w:trPr>
+          <w:trHeight w:val="1572"/>
+        </w:trPr>
+        <w:tc>
+          <w:tcPr>
+            <w:tcW w:w="1520" w:type="dxa"/>
+            <w:tcBorders>
+              <w:bottom w:val="single" w:sz="8" w:space="0" w:color="auto"/>
+            </w:tcBorders>
+            <w:shd w:val="clear" w:color="auto" w:fill="auto"/>
+            <w:vAlign w:val="center"/>
+          </w:tcPr>
+          <w:p>
+            <w:pPr>
+              <w:rPr>
+                <w:rFonts w:eastAsia="Times New Roman"/>
+                <w:color w:val="000000"/>
+                <w:sz w:val="24"/>
+                <w:szCs w:val="24"/>
+              </w:rPr>
+            </w:pPr>
+            <w:r>
+              <w:rPr>
+                <w:rFonts w:eastAsia="Times New Roman"/>
+                <w:color w:val="000000"/>
+                <w:sz w:val="24"/>
+                <w:szCs w:val="24"/>
+              </w:rPr>
+              <w:t>1RT700</w:t>
+            </w:r>
+          </w:p>
+        </w:tc>
+        <w:tc>
+          <w:tcPr>
+            <w:tcW w:w="1766" w:type="dxa"/>
+            <w:tcBorders>
+              <w:bottom w:val="single" w:sz="8" w:space="0" w:color="auto"/>
+            </w:tcBorders>
+            <w:shd w:val="clear" w:color="auto" w:fill="auto"/>
+            <w:vAlign w:val="center"/>
+          </w:tcPr>
+          <w:p>
+            <w:pPr>
+              <w:rPr>
+                <w:rFonts w:eastAsia="Times New Roman"/>
+                <w:color w:val="000000"/>
+                <w:sz w:val="24"/>
+                <w:szCs w:val="24"/>
+              </w:rPr>
+            </w:pPr>
+            <w:r>
+              <w:rPr>
+                <w:rFonts w:eastAsia="Times New Roman"/>
+                <w:color w:val="000000"/>
+                <w:sz w:val="24"/>
+                <w:szCs w:val="24"/>
+              </w:rPr>
+              <w:t>Statistical Machine Learning</w:t>
+            </w:r>
+          </w:p>
+        </w:tc>
+        <w:tc>
+          <w:tcPr>
+            <w:tcW w:w="1052" w:type="dxa"/>
+            <w:vMerge/>
+            <w:tcBorders>
+              <w:bottom w:val="single" w:sz="8" w:space="0" w:color="auto"/>
+            </w:tcBorders>
+            <w:shd w:val="clear" w:color="auto" w:fill="auto"/>
+            <w:vAlign w:val="center"/>
+          </w:tcPr>
+          <w:p>
+            <w:pPr>
+              <w:rPr>
+                <w:rFonts w:eastAsia="Times New Roman"/>
+                <w:color w:val="000000"/>
+                <w:sz w:val="24"/>
+                <w:szCs w:val="24"/>
+              </w:rPr>
+            </w:pPr>
+          </w:p>
+        </w:tc>
+        <w:tc>
+          <w:tcPr>
+            <w:tcW w:w="2630" w:type="dxa"/>
+            <w:vMerge/>
+            <w:tcBorders>
+              <w:bottom w:val="single" w:sz="8" w:space="0" w:color="auto"/>
+            </w:tcBorders>
+            <w:shd w:val="clear" w:color="auto" w:fill="auto"/>
+            <w:vAlign w:val="center"/>
+          </w:tcPr>
+          <w:p>
+            <w:pPr>
+              <w:rPr>
+                <w:rFonts w:eastAsia="Times New Roman"/>
+                <w:color w:val="000000"/>
+                <w:sz w:val="24"/>
+                <w:szCs w:val="24"/>
+              </w:rPr>
+            </w:pPr>
+          </w:p>
+        </w:tc>
+        <w:tc>
+          <w:tcPr>
+            <w:tcW w:w="2950" w:type="dxa"/>
+            <w:vMerge/>
+            <w:tcBorders>
+              <w:bottom w:val="single" w:sz="8" w:space="0" w:color="auto"/>
+            </w:tcBorders>
+            <w:shd w:val="clear" w:color="auto" w:fill="auto"/>
+            <w:vAlign w:val="center"/>
+          </w:tcPr>
+          <w:p>
+            <w:pPr>
+              <w:rPr>
+                <w:rFonts w:eastAsia="Times New Roman"/>
+                <w:color w:val="000000"/>
+                <w:sz w:val="24"/>
+                <w:szCs w:val="24"/>
+              </w:rPr>
+            </w:pPr>
+          </w:p>
+        </w:tc>
+      </w:tr>
+      <w:tr>
+        <w:trPr>
+          <w:trHeight w:val="1572"/>
+        </w:trPr>
+        <w:tc>
+          <w:tcPr>
+            <w:tcW w:w="1520" w:type="dxa"/>
+            <w:tcBorders>
+              <w:bottom w:val="single" w:sz="8" w:space="0" w:color="auto"/>
+            </w:tcBorders>
+            <w:shd w:val="clear" w:color="auto" w:fill="auto"/>
+            <w:vAlign w:val="center"/>
+          </w:tcPr>
+          <w:p>
+            <w:pPr>
+              <w:rPr>
+                <w:rFonts w:eastAsia="Times New Roman"/>
+                <w:color w:val="000000"/>
+                <w:sz w:val="24"/>
+                <w:szCs w:val="24"/>
+              </w:rPr>
+            </w:pPr>
+            <w:r>
+              <w:rPr>
+                <w:rFonts w:eastAsia="Times New Roman"/>
+                <w:color w:val="000000"/>
+                <w:sz w:val="24"/>
+                <w:szCs w:val="24"/>
+              </w:rPr>
+              <w:t>5SD808</w:t>
+            </w:r>
+          </w:p>
+        </w:tc>
+        <w:tc>
+          <w:tcPr>
+            <w:tcW w:w="1766" w:type="dxa"/>
+            <w:tcBorders>
+              <w:bottom w:val="single" w:sz="8" w:space="0" w:color="auto"/>
+            </w:tcBorders>
+            <w:shd w:val="clear" w:color="auto" w:fill="auto"/>
+            <w:vAlign w:val="center"/>
+          </w:tcPr>
+          <w:p>
+            <w:pPr>
+              <w:rPr>
+                <w:rFonts w:eastAsia="Times New Roman"/>
+                <w:color w:val="000000"/>
+                <w:sz w:val="24"/>
+                <w:szCs w:val="24"/>
+              </w:rPr>
+            </w:pPr>
+            <w:r>
+              <w:rPr>
+                <w:rFonts w:eastAsia="Times New Roman"/>
+                <w:color w:val="000000"/>
+                <w:sz w:val="24"/>
+                <w:szCs w:val="24"/>
+              </w:rPr>
+              <w:t>Network Programming for Games 1</w:t>
+            </w:r>
+          </w:p>
+        </w:tc>
+        <w:tc>
+          <w:tcPr>
+            <w:tcW w:w="1052" w:type="dxa"/>
+            <w:tcBorders>
+              <w:bottom w:val="single" w:sz="8" w:space="0" w:color="auto"/>
+            </w:tcBorders>
+            <w:shd w:val="clear" w:color="auto" w:fill="auto"/>
+            <w:vAlign w:val="center"/>
+          </w:tcPr>
+          <w:p>
+            <w:pPr>
+              <w:rPr>
+                <w:rFonts w:eastAsia="Times New Roman"/>
+                <w:color w:val="000000"/>
+                <w:sz w:val="24"/>
+                <w:szCs w:val="24"/>
+              </w:rPr>
+            </w:pPr>
+            <w:r>
+              <w:rPr>
+                <w:rFonts w:eastAsia="Times New Roman"/>
+                <w:color w:val="000000"/>
+                <w:sz w:val="24"/>
+                <w:szCs w:val="24"/>
+              </w:rPr>
+              <w:t>CS3101</w:t>
+            </w:r>
+          </w:p>
+        </w:tc>
+        <w:tc>
+          <w:tcPr>
+            <w:tcW w:w="2630" w:type="dxa"/>
+            <w:tcBorders>
+              <w:bottom w:val="single" w:sz="8" w:space="0" w:color="auto"/>
+            </w:tcBorders>
+            <w:shd w:val="clear" w:color="auto" w:fill="auto"/>
+            <w:vAlign w:val="center"/>
+          </w:tcPr>
+          <w:p>
+            <w:pPr>
+              <w:rPr>
+                <w:rFonts w:eastAsia="Times New Roman"/>
+                <w:color w:val="000000"/>
+                <w:sz w:val="24"/>
+                <w:szCs w:val="24"/>
+              </w:rPr>
+            </w:pPr>
+            <w:r>
+              <w:rPr>
+                <w:rFonts w:eastAsia="Times New Roman"/>
+                <w:color w:val="000000"/>
+                <w:sz w:val="24"/>
+                <w:szCs w:val="24"/>
+              </w:rPr>
+              <w:t>Computer Networks Practice</w:t>
+            </w:r>
+          </w:p>
+        </w:tc>
+        <w:tc>
+          <w:tcPr>
+            <w:tcW w:w="2950" w:type="dxa"/>
+            <w:tcBorders>
+              <w:bottom w:val="single" w:sz="8" w:space="0" w:color="auto"/>
+            </w:tcBorders>
+            <w:shd w:val="clear" w:color="auto" w:fill="auto"/>
+            <w:vAlign w:val="center"/>
+          </w:tcPr>
+          <w:p>
+            <w:pPr>
+              <w:rPr>
+                <w:rFonts w:eastAsia="Times New Roman"/>
+                <w:color w:val="000000"/>
+                <w:sz w:val="24"/>
+                <w:szCs w:val="24"/>
+              </w:rPr>
+            </w:pPr>
+          </w:p>
+          <w:p>
+            <w:pPr>
+              <w:rPr>
+                <w:rFonts w:eastAsia="Times New Roman"/>
+                <w:color w:val="000000"/>
+                <w:sz w:val="24"/>
+                <w:szCs w:val="24"/>
+              </w:rPr>
+            </w:pPr>
+          </w:p>
+          <w:p>
+            <w:pPr>
+              <w:rPr>
+                <w:rFonts w:eastAsia="Times New Roman"/>
+                <w:sz w:val="24"/>
+                <w:szCs w:val="24"/>
+              </w:rPr>
+            </w:pPr>
+            <w:r>
+              <w:rPr>
+                <w:rFonts w:eastAsia="Times New Roman"/>
+                <w:sz w:val="24"/>
+                <w:szCs w:val="24"/>
+              </w:rPr>
+              <w:t>CS2105 to be completed in AY25/26 Sem 2 to clear prerequisites</w:t>
+            </w:r>
+          </w:p>
+        </w:tc>
+      </w:tr>
+      <w:tr>
+        <w:trPr>
+          <w:trHeight w:val="1572"/>
+        </w:trPr>
+        <w:tc>
+          <w:tcPr>
+            <w:tcW w:w="1520" w:type="dxa"/>
+            <w:tcBorders>
+              <w:bottom w:val="single" w:sz="8" w:space="0" w:color="auto"/>
+            </w:tcBorders>
+            <w:shd w:val="clear" w:color="auto" w:fill="auto"/>
+            <w:vAlign w:val="center"/>
+          </w:tcPr>
+          <w:p>
+            <w:pPr>
+              <w:rPr>
+                <w:rFonts w:eastAsia="Times New Roman"/>
+                <w:color w:val="000000"/>
+                <w:sz w:val="24"/>
+                <w:szCs w:val="24"/>
+              </w:rPr>
+            </w:pPr>
+            <w:r>
+              <w:rPr>
+                <w:rFonts w:eastAsia="Times New Roman"/>
+                <w:color w:val="000000"/>
+                <w:sz w:val="24"/>
+                <w:szCs w:val="24"/>
+              </w:rPr>
+              <w:t>1DT194</w:t>
+            </w:r>
+          </w:p>
+        </w:tc>
+        <w:tc>
+          <w:tcPr>
+            <w:tcW w:w="1766" w:type="dxa"/>
+            <w:tcBorders>
+              <w:bottom w:val="single" w:sz="8" w:space="0" w:color="auto"/>
+            </w:tcBorders>
+            <w:shd w:val="clear" w:color="auto" w:fill="auto"/>
+            <w:vAlign w:val="center"/>
+          </w:tcPr>
+          <w:p>
+            <w:pPr>
+              <w:rPr>
+                <w:rFonts w:eastAsia="Times New Roman"/>
+                <w:color w:val="000000"/>
+                <w:sz w:val="24"/>
+                <w:szCs w:val="24"/>
+              </w:rPr>
+            </w:pPr>
+            <w:r>
+              <w:rPr>
+                <w:rFonts w:eastAsia="Times New Roman"/>
+                <w:color w:val="000000"/>
+                <w:sz w:val="24"/>
+                <w:szCs w:val="24"/>
+              </w:rPr>
+              <w:t>Wireless Communication and Networked Embedded Systems</w:t>
+            </w:r>
+          </w:p>
+        </w:tc>
+        <w:tc>
+          <w:tcPr>
+            <w:tcW w:w="1052" w:type="dxa"/>
+            <w:tcBorders>
+              <w:bottom w:val="single" w:sz="8" w:space="0" w:color="auto"/>
+            </w:tcBorders>
+            <w:shd w:val="clear" w:color="auto" w:fill="auto"/>
+            <w:vAlign w:val="center"/>
+          </w:tcPr>
+          <w:p>
+            <w:pPr>
+              <w:rPr>
+                <w:rFonts w:eastAsia="Times New Roman"/>
+                <w:color w:val="000000"/>
+                <w:sz w:val="24"/>
+                <w:szCs w:val="24"/>
+              </w:rPr>
+            </w:pPr>
+            <w:r>
+              <w:rPr>
+                <w:rFonts w:eastAsia="Times New Roman"/>
+                <w:color w:val="000000"/>
+                <w:sz w:val="24"/>
+                <w:szCs w:val="24"/>
+              </w:rPr>
+              <w:t>CS4222</w:t>
+            </w:r>
+          </w:p>
+        </w:tc>
+        <w:tc>
+          <w:tcPr>
+            <w:tcW w:w="2630" w:type="dxa"/>
+            <w:tcBorders>
+              <w:bottom w:val="single" w:sz="8" w:space="0" w:color="auto"/>
+            </w:tcBorders>
+            <w:shd w:val="clear" w:color="auto" w:fill="auto"/>
+            <w:vAlign w:val="center"/>
+          </w:tcPr>
+          <w:p>
+            <w:pPr>
+              <w:rPr>
+                <w:rFonts w:eastAsia="Times New Roman"/>
+                <w:color w:val="000000"/>
+                <w:sz w:val="24"/>
+                <w:szCs w:val="24"/>
+              </w:rPr>
+            </w:pPr>
+            <w:r>
+              <w:rPr>
+                <w:rFonts w:eastAsia="Times New Roman"/>
+                <w:color w:val="000000"/>
+                <w:sz w:val="24"/>
+                <w:szCs w:val="24"/>
+              </w:rPr>
+              <w:t>Wireless Networking</w:t>
+            </w:r>
+          </w:p>
+        </w:tc>
+        <w:tc>
+          <w:tcPr>
+            <w:tcW w:w="2950" w:type="dxa"/>
+            <w:tcBorders>
+              <w:bottom w:val="single" w:sz="8" w:space="0" w:color="auto"/>
+            </w:tcBorders>
+            <w:shd w:val="clear" w:color="auto" w:fill="auto"/>
+            <w:vAlign w:val="center"/>
+          </w:tcPr>
+          <w:p>
+            <w:pPr>
+              <w:rPr>
+                <w:rFonts w:eastAsia="Times New Roman"/>
+                <w:color w:val="000000"/>
+                <w:sz w:val="24"/>
+                <w:szCs w:val="24"/>
+              </w:rPr>
+            </w:pPr>
+            <w:r>
+              <w:rPr>
+                <w:rFonts w:eastAsia="Times New Roman"/>
+                <w:sz w:val="24"/>
+                <w:szCs w:val="24"/>
+              </w:rPr>
+              <w:t>CS2105 to be completed in AY25/26 Sem 2</w:t>
+            </w:r>
+            <w:r>
+              <w:rPr>
+                <w:rFonts w:eastAsia="Times New Roman"/>
+                <w:sz w:val="24"/>
+                <w:szCs w:val="24"/>
+              </w:rPr>
+              <w:t xml:space="preserve"> to clear prerequisites </w:t>
+            </w:r>
+          </w:p>
+        </w:tc>
+      </w:tr>
+      <w:tr>
+        <w:trPr>
+          <w:trHeight w:val="1572"/>
+        </w:trPr>
+        <w:tc>
+          <w:tcPr>
+            <w:tcW w:w="1520" w:type="dxa"/>
+            <w:tcBorders>
+              <w:bottom w:val="single" w:sz="8" w:space="0" w:color="auto"/>
+            </w:tcBorders>
+            <w:shd w:val="clear" w:color="auto" w:fill="auto"/>
+            <w:vAlign w:val="center"/>
+          </w:tcPr>
+          <w:p>
+            <w:pPr>
+              <w:rPr>
+                <w:rFonts w:eastAsia="Times New Roman"/>
+                <w:color w:val="000000"/>
+                <w:sz w:val="24"/>
+                <w:szCs w:val="24"/>
+              </w:rPr>
+            </w:pPr>
+            <w:r>
+              <w:rPr>
+                <w:rFonts w:eastAsia="Times New Roman"/>
+                <w:color w:val="000000"/>
+                <w:sz w:val="24"/>
+                <w:szCs w:val="24"/>
+              </w:rPr>
+              <w:t>1DT242</w:t>
+            </w:r>
+          </w:p>
+        </w:tc>
+        <w:tc>
+          <w:tcPr>
+            <w:tcW w:w="1766" w:type="dxa"/>
+            <w:tcBorders>
+              <w:bottom w:val="single" w:sz="8" w:space="0" w:color="auto"/>
+            </w:tcBorders>
+            <w:shd w:val="clear" w:color="auto" w:fill="auto"/>
+            <w:vAlign w:val="center"/>
+          </w:tcPr>
+          <w:p>
+            <w:pPr>
+              <w:rPr>
+                <w:rFonts w:eastAsia="Times New Roman"/>
+                <w:color w:val="000000"/>
+                <w:sz w:val="24"/>
+                <w:szCs w:val="24"/>
+              </w:rPr>
+            </w:pPr>
+            <w:r>
+              <w:rPr>
+                <w:rFonts w:eastAsia="Times New Roman"/>
+                <w:color w:val="000000"/>
+                <w:sz w:val="24"/>
+                <w:szCs w:val="24"/>
+              </w:rPr>
+              <w:t>Advanced Software Design</w:t>
+            </w:r>
+          </w:p>
+        </w:tc>
+        <w:tc>
+          <w:tcPr>
+            <w:tcW w:w="1052" w:type="dxa"/>
+            <w:tcBorders>
+              <w:bottom w:val="single" w:sz="8" w:space="0" w:color="auto"/>
+            </w:tcBorders>
+            <w:shd w:val="clear" w:color="auto" w:fill="auto"/>
+            <w:vAlign w:val="center"/>
+          </w:tcPr>
+          <w:p>
+            <w:pPr>
+              <w:rPr>
+                <w:rFonts w:eastAsia="Times New Roman"/>
+                <w:color w:val="000000"/>
+                <w:sz w:val="24"/>
+                <w:szCs w:val="24"/>
+              </w:rPr>
+            </w:pPr>
+            <w:r>
+              <w:rPr>
+                <w:rFonts w:eastAsia="Times New Roman"/>
+                <w:color w:val="000000"/>
+                <w:sz w:val="24"/>
+                <w:szCs w:val="24"/>
+              </w:rPr>
+              <w:t>CS5272</w:t>
+            </w:r>
+          </w:p>
+        </w:tc>
+        <w:tc>
+          <w:tcPr>
+            <w:tcW w:w="2630" w:type="dxa"/>
+            <w:tcBorders>
+              <w:bottom w:val="single" w:sz="8" w:space="0" w:color="auto"/>
+            </w:tcBorders>
+            <w:shd w:val="clear" w:color="auto" w:fill="auto"/>
+            <w:vAlign w:val="center"/>
+          </w:tcPr>
+          <w:p>
+            <w:pPr>
+              <w:rPr>
+                <w:rFonts w:eastAsia="Times New Roman"/>
+                <w:color w:val="000000"/>
+                <w:sz w:val="24"/>
+                <w:szCs w:val="24"/>
+              </w:rPr>
+            </w:pPr>
+            <w:r>
+              <w:rPr>
+                <w:rFonts w:eastAsia="Times New Roman"/>
+                <w:color w:val="000000"/>
+                <w:sz w:val="24"/>
+                <w:szCs w:val="24"/>
+              </w:rPr>
+              <w:t>Embedded Software Design</w:t>
+            </w:r>
+          </w:p>
+        </w:tc>
+        <w:tc>
+          <w:tcPr>
+            <w:tcW w:w="2950" w:type="dxa"/>
+            <w:tcBorders>
+              <w:bottom w:val="single" w:sz="8" w:space="0" w:color="auto"/>
+            </w:tcBorders>
+            <w:shd w:val="clear" w:color="auto" w:fill="auto"/>
+            <w:vAlign w:val="center"/>
+          </w:tcPr>
+          <w:p>
+            <w:pPr>
+              <w:rPr>
+                <w:rFonts w:eastAsia="Times New Roman"/>
+                <w:color w:val="000000"/>
+                <w:sz w:val="24"/>
+                <w:szCs w:val="24"/>
+              </w:rPr>
+            </w:pPr>
+            <w:r>
+              <w:rPr>
+                <w:rFonts w:eastAsia="Times New Roman"/>
+                <w:color w:val="000000"/>
+                <w:sz w:val="24"/>
+                <w:szCs w:val="24"/>
+              </w:rPr>
+              <w:t>CS2106 to be completed in AY25/26 Sem 2 to clear prerequisites</w:t>
+            </w:r>
+          </w:p>
+        </w:tc>
+      </w:tr>
+      <w:tr>
+        <w:trPr>
+          <w:trHeight w:val="1572"/>
+        </w:trPr>
+        <w:tc>
+          <w:tcPr>
+            <w:tcW w:w="1520" w:type="dxa"/>
+            <w:tcBorders>
+              <w:bottom w:val="single" w:sz="8" w:space="0" w:color="auto"/>
+            </w:tcBorders>
+            <w:shd w:val="clear" w:color="auto" w:fill="auto"/>
+            <w:vAlign w:val="center"/>
+          </w:tcPr>
+          <w:p>
+            <w:pPr>
+              <w:rPr>
+                <w:rFonts w:eastAsia="Times New Roman"/>
+                <w:color w:val="000000"/>
+                <w:sz w:val="24"/>
+                <w:szCs w:val="24"/>
+              </w:rPr>
+            </w:pPr>
+            <w:r>
+              <w:rPr>
+                <w:rFonts w:eastAsia="Times New Roman"/>
+                <w:color w:val="000000"/>
+                <w:sz w:val="24"/>
+                <w:szCs w:val="24"/>
+              </w:rPr>
+              <w:t>1DL590</w:t>
+            </w:r>
+          </w:p>
+        </w:tc>
+        <w:tc>
+          <w:tcPr>
+            <w:tcW w:w="1766" w:type="dxa"/>
+            <w:tcBorders>
+              <w:bottom w:val="single" w:sz="8" w:space="0" w:color="auto"/>
+            </w:tcBorders>
+            <w:shd w:val="clear" w:color="auto" w:fill="auto"/>
+            <w:vAlign w:val="center"/>
+          </w:tcPr>
+          <w:p>
+            <w:pPr>
+              <w:rPr>
+                <w:rFonts w:eastAsia="Times New Roman"/>
+                <w:color w:val="000000"/>
+                <w:sz w:val="24"/>
+                <w:szCs w:val="24"/>
+              </w:rPr>
+            </w:pPr>
+            <w:r>
+              <w:rPr>
+                <w:rFonts w:eastAsia="Times New Roman"/>
+                <w:color w:val="000000"/>
+                <w:sz w:val="24"/>
+                <w:szCs w:val="24"/>
+              </w:rPr>
+              <w:t>Concurrent Algorithms and Data Structures</w:t>
+            </w:r>
+          </w:p>
+        </w:tc>
+        <w:tc>
+          <w:tcPr>
+            <w:tcW w:w="1052" w:type="dxa"/>
+            <w:shd w:val="clear" w:color="auto" w:fill="auto"/>
+            <w:vAlign w:val="center"/>
+          </w:tcPr>
+          <w:p>
+            <w:pPr>
+              <w:rPr>
+                <w:rFonts w:eastAsia="Times New Roman"/>
+                <w:color w:val="000000"/>
+                <w:sz w:val="24"/>
+                <w:szCs w:val="24"/>
+              </w:rPr>
+            </w:pPr>
+            <w:r>
+              <w:rPr>
+                <w:rFonts w:eastAsia="Times New Roman"/>
+                <w:color w:val="000000"/>
+                <w:sz w:val="24"/>
+                <w:szCs w:val="24"/>
+              </w:rPr>
+              <w:t>CS3211</w:t>
+            </w:r>
+          </w:p>
+        </w:tc>
+        <w:tc>
+          <w:tcPr>
+            <w:tcW w:w="2630" w:type="dxa"/>
+            <w:shd w:val="clear" w:color="auto" w:fill="auto"/>
+            <w:vAlign w:val="center"/>
+          </w:tcPr>
+          <w:p>
+            <w:pPr>
+              <w:rPr>
+                <w:rFonts w:eastAsia="Times New Roman"/>
+                <w:color w:val="000000"/>
+                <w:sz w:val="24"/>
+                <w:szCs w:val="24"/>
+              </w:rPr>
+            </w:pPr>
+            <w:r>
+              <w:rPr>
+                <w:rFonts w:eastAsia="Times New Roman"/>
+                <w:color w:val="000000"/>
+                <w:sz w:val="24"/>
+                <w:szCs w:val="24"/>
+              </w:rPr>
+              <w:t xml:space="preserve">Parallel and Concurrent Programming </w:t>
+            </w:r>
+          </w:p>
+        </w:tc>
+        <w:tc>
+          <w:tcPr>
+            <w:tcW w:w="2950" w:type="dxa"/>
+            <w:shd w:val="clear" w:color="auto" w:fill="auto"/>
+            <w:vAlign w:val="center"/>
+          </w:tcPr>
+          <w:p>
+            <w:pPr>
+              <w:rPr>
+                <w:rFonts w:eastAsia="Times New Roman"/>
+                <w:color w:val="000000"/>
+                <w:sz w:val="24"/>
+                <w:szCs w:val="24"/>
+              </w:rPr>
+            </w:pPr>
+            <w:r>
+              <w:rPr>
+                <w:rFonts w:eastAsia="Times New Roman"/>
+                <w:color w:val="000000"/>
+                <w:sz w:val="24"/>
+                <w:szCs w:val="24"/>
+              </w:rPr>
+              <w:t>CS2106 to be completed in AY25/26 Sem 2 to clear prerequisites</w:t>
+            </w:r>
+          </w:p>
+        </w:tc>
+      </w:tr>
+      <w:tr>
+        <w:trPr>
+          <w:trHeight w:val="1572"/>
+        </w:trPr>
+        <w:tc>
+          <w:tcPr>
+            <w:tcW w:w="1520" w:type="dxa"/>
+            <w:tcBorders>
+              <w:bottom w:val="single" w:sz="8" w:space="0" w:color="auto"/>
+            </w:tcBorders>
+            <w:shd w:val="clear" w:color="auto" w:fill="auto"/>
+            <w:vAlign w:val="center"/>
+          </w:tcPr>
+          <w:p>
+            <w:pPr>
+              <w:rPr>
+                <w:rFonts w:eastAsia="Times New Roman"/>
+                <w:color w:val="000000"/>
+                <w:sz w:val="24"/>
+                <w:szCs w:val="24"/>
+              </w:rPr>
+            </w:pPr>
+            <w:r>
+              <w:rPr>
+                <w:rFonts w:eastAsia="Times New Roman"/>
+                <w:color w:val="000000"/>
+                <w:sz w:val="24"/>
+                <w:szCs w:val="24"/>
+              </w:rPr>
+              <w:t>1DL530</w:t>
+            </w:r>
+          </w:p>
+        </w:tc>
+        <w:tc>
+          <w:tcPr>
+            <w:tcW w:w="1766" w:type="dxa"/>
+            <w:tcBorders>
+              <w:bottom w:val="single" w:sz="8" w:space="0" w:color="auto"/>
+            </w:tcBorders>
+            <w:shd w:val="clear" w:color="auto" w:fill="auto"/>
+            <w:vAlign w:val="center"/>
+          </w:tcPr>
+          <w:p>
+            <w:pPr>
+              <w:rPr>
+                <w:rFonts w:eastAsia="Times New Roman"/>
+                <w:color w:val="000000"/>
+                <w:sz w:val="24"/>
+                <w:szCs w:val="24"/>
+              </w:rPr>
+            </w:pPr>
+            <w:r>
+              <w:rPr>
+                <w:rFonts w:eastAsia="Times New Roman"/>
+                <w:color w:val="000000"/>
+                <w:sz w:val="24"/>
+                <w:szCs w:val="24"/>
+              </w:rPr>
+              <w:t>Introduction to Parallel Programming</w:t>
+            </w:r>
+          </w:p>
+        </w:tc>
+        <w:tc>
+          <w:tcPr>
+            <w:tcW w:w="1052" w:type="dxa"/>
+            <w:shd w:val="clear" w:color="auto" w:fill="auto"/>
+            <w:vAlign w:val="center"/>
+          </w:tcPr>
+          <w:p>
+            <w:pPr>
+              <w:rPr>
+                <w:rFonts w:eastAsia="Times New Roman"/>
+                <w:color w:val="000000"/>
+                <w:sz w:val="24"/>
+                <w:szCs w:val="24"/>
+              </w:rPr>
+            </w:pPr>
+            <w:r>
+              <w:rPr>
+                <w:rFonts w:eastAsia="Times New Roman"/>
+                <w:color w:val="000000"/>
+                <w:sz w:val="24"/>
+                <w:szCs w:val="24"/>
+              </w:rPr>
+              <w:t>CS3210</w:t>
+            </w:r>
+          </w:p>
+        </w:tc>
+        <w:tc>
+          <w:tcPr>
+            <w:tcW w:w="2630" w:type="dxa"/>
+            <w:shd w:val="clear" w:color="auto" w:fill="auto"/>
+            <w:vAlign w:val="center"/>
+          </w:tcPr>
+          <w:p>
+            <w:pPr>
+              <w:rPr>
+                <w:rFonts w:eastAsia="Times New Roman"/>
+                <w:color w:val="000000"/>
+                <w:sz w:val="24"/>
+                <w:szCs w:val="24"/>
+              </w:rPr>
+            </w:pPr>
+            <w:r>
+              <w:rPr>
+                <w:rFonts w:eastAsia="Times New Roman"/>
+                <w:color w:val="000000"/>
+                <w:sz w:val="24"/>
+                <w:szCs w:val="24"/>
+              </w:rPr>
+              <w:t xml:space="preserve">Parallel Programming </w:t>
+            </w:r>
+          </w:p>
+        </w:tc>
+        <w:tc>
+          <w:tcPr>
+            <w:tcW w:w="2950" w:type="dxa"/>
+            <w:shd w:val="clear" w:color="auto" w:fill="auto"/>
+            <w:vAlign w:val="center"/>
+          </w:tcPr>
+          <w:p>
+            <w:pPr>
+              <w:rPr>
+                <w:rFonts w:eastAsia="Times New Roman"/>
+                <w:color w:val="000000"/>
+                <w:sz w:val="24"/>
+                <w:szCs w:val="24"/>
+              </w:rPr>
+            </w:pPr>
+            <w:r>
+              <w:rPr>
+                <w:rFonts w:eastAsia="Times New Roman"/>
+                <w:color w:val="000000"/>
+                <w:sz w:val="24"/>
+                <w:szCs w:val="24"/>
+              </w:rPr>
+              <w:t>CS2100 to be taken in AY25/26 S1 to clear pre requisites</w:t>
             </w:r>
           </w:p>
         </w:tc>
@@ -1015,7 +2636,7 @@
         </w:trPr>
         <w:tc>
           <w:tcPr>
-            <w:tcW w:w="3690" w:type="dxa"/>
+            <w:tcW w:w="4338" w:type="dxa"/>
             <w:gridSpan w:val="3"/>
             <w:tcBorders>
               <w:top w:val="single" w:sz="8" w:space="0" w:color="auto"/>
@@ -1167,7 +2788,7 @@
         </w:trPr>
         <w:tc>
           <w:tcPr>
-            <w:tcW w:w="1260" w:type="dxa"/>
+            <w:tcW w:w="1520" w:type="dxa"/>
             <w:tcBorders>
               <w:top w:val="single" w:sz="8" w:space="0" w:color="auto"/>
             </w:tcBorders>
@@ -1191,13 +2812,14 @@
                 <w:sz w:val="24"/>
                 <w:szCs w:val="24"/>
               </w:rPr>
+              <w:lastRenderedPageBreak/>
               <w:t>PU course Code</w:t>
             </w:r>
           </w:p>
         </w:tc>
         <w:tc>
           <w:tcPr>
-            <w:tcW w:w="1170" w:type="dxa"/>
+            <w:tcW w:w="1766" w:type="dxa"/>
             <w:tcBorders>
               <w:top w:val="single" w:sz="8" w:space="0" w:color="auto"/>
             </w:tcBorders>
@@ -1227,7 +2849,7 @@
         </w:tc>
         <w:tc>
           <w:tcPr>
-            <w:tcW w:w="1260" w:type="dxa"/>
+            <w:tcW w:w="1052" w:type="dxa"/>
             <w:tcBorders>
               <w:top w:val="single" w:sz="8" w:space="0" w:color="auto"/>
             </w:tcBorders>
@@ -1322,7 +2944,7 @@
         </w:trPr>
         <w:tc>
           <w:tcPr>
-            <w:tcW w:w="1260" w:type="dxa"/>
+            <w:tcW w:w="1520" w:type="dxa"/>
             <w:shd w:val="clear" w:color="auto" w:fill="auto"/>
             <w:vAlign w:val="center"/>
             <w:hideMark/>
@@ -1345,11 +2967,47 @@
               </w:rPr>
               <w:t> </w:t>
             </w:r>
-          </w:p>
-        </w:tc>
-        <w:tc>
-          <w:tcPr>
-            <w:tcW w:w="1170" w:type="dxa"/>
+            <w:r>
+              <w:rPr>
+                <w:rFonts w:eastAsia="Times New Roman"/>
+                <w:color w:val="000000"/>
+                <w:sz w:val="24"/>
+                <w:szCs w:val="24"/>
+              </w:rPr>
+              <w:t>1DL034</w:t>
+            </w:r>
+          </w:p>
+        </w:tc>
+        <w:tc>
+          <w:tcPr>
+            <w:tcW w:w="1766" w:type="dxa"/>
+            <w:shd w:val="clear" w:color="auto" w:fill="auto"/>
+            <w:vAlign w:val="center"/>
+            <w:hideMark/>
+          </w:tcPr>
+          <w:p>
+            <w:pPr>
+              <w:rPr>
+                <w:rFonts w:eastAsia="Times New Roman"/>
+                <w:color w:val="000000"/>
+                <w:sz w:val="24"/>
+                <w:szCs w:val="24"/>
+              </w:rPr>
+            </w:pPr>
+            <w:r>
+              <w:rPr>
+                <w:rFonts w:eastAsia="Times New Roman"/>
+                <w:color w:val="000000"/>
+                <w:sz w:val="24"/>
+                <w:szCs w:val="24"/>
+              </w:rPr>
+              <w:t>Introduction to Machine learning</w:t>
+            </w:r>
+          </w:p>
+        </w:tc>
+        <w:tc>
+          <w:tcPr>
+            <w:tcW w:w="1052" w:type="dxa"/>
             <w:shd w:val="clear" w:color="auto" w:fill="auto"/>
             <w:vAlign w:val="center"/>
             <w:hideMark/>
@@ -1372,11 +3030,20 @@
               </w:rPr>
               <w:t> </w:t>
             </w:r>
-          </w:p>
-        </w:tc>
-        <w:tc>
-          <w:tcPr>
-            <w:tcW w:w="1260" w:type="dxa"/>
+            <w:r>
+              <w:rPr>
+                <w:rFonts w:eastAsia="Times New Roman"/>
+                <w:color w:val="000000"/>
+                <w:sz w:val="24"/>
+                <w:szCs w:val="24"/>
+              </w:rPr>
+              <w:t>CS3244</w:t>
+            </w:r>
+          </w:p>
+        </w:tc>
+        <w:tc>
+          <w:tcPr>
+            <w:tcW w:w="2630" w:type="dxa"/>
             <w:shd w:val="clear" w:color="auto" w:fill="auto"/>
             <w:vAlign w:val="center"/>
             <w:hideMark/>
@@ -1399,6 +3066,98 @@
               </w:rPr>
               <w:t> </w:t>
             </w:r>
+            <w:r>
+              <w:rPr>
+                <w:rFonts w:eastAsia="Times New Roman"/>
+                <w:color w:val="000000"/>
+                <w:sz w:val="24"/>
+                <w:szCs w:val="24"/>
+              </w:rPr>
+              <w:t xml:space="preserve">Machine Learning </w:t>
+            </w:r>
+          </w:p>
+        </w:tc>
+        <w:tc>
+          <w:tcPr>
+            <w:tcW w:w="2950" w:type="dxa"/>
+            <w:shd w:val="clear" w:color="auto" w:fill="auto"/>
+            <w:vAlign w:val="center"/>
+            <w:hideMark/>
+          </w:tcPr>
+          <w:p>
+            <w:pPr>
+              <w:rPr>
+                <w:rFonts w:eastAsia="Times New Roman"/>
+                <w:color w:val="000000"/>
+                <w:sz w:val="24"/>
+                <w:szCs w:val="24"/>
+              </w:rPr>
+            </w:pPr>
+            <w:r>
+              <w:rPr>
+                <w:rFonts w:eastAsia="Times New Roman"/>
+                <w:color w:val="000000"/>
+                <w:sz w:val="24"/>
+                <w:szCs w:val="24"/>
+              </w:rPr>
+              <w:t xml:space="preserve">Please check if this is a restricted course in the partner university. Also, please note that you have to fulfil the prescribe NUS’ pre requisites before you read the courses during your exchange. </w:t>
+            </w:r>
+          </w:p>
+        </w:tc>
+      </w:tr>
+      <w:tr>
+        <w:trPr>
+          <w:trHeight w:val="1572"/>
+        </w:trPr>
+        <w:tc>
+          <w:tcPr>
+            <w:tcW w:w="1520" w:type="dxa"/>
+            <w:shd w:val="clear" w:color="auto" w:fill="auto"/>
+            <w:vAlign w:val="center"/>
+          </w:tcPr>
+          <w:p>
+            <w:pPr>
+              <w:rPr>
+                <w:rFonts w:eastAsia="Times New Roman"/>
+                <w:color w:val="000000"/>
+                <w:sz w:val="24"/>
+                <w:szCs w:val="24"/>
+              </w:rPr>
+            </w:pPr>
+          </w:p>
+        </w:tc>
+        <w:tc>
+          <w:tcPr>
+            <w:tcW w:w="1766" w:type="dxa"/>
+            <w:shd w:val="clear" w:color="auto" w:fill="auto"/>
+            <w:vAlign w:val="center"/>
+          </w:tcPr>
+          <w:p>
+            <w:pPr>
+              <w:rPr>
+                <w:rFonts w:eastAsia="Times New Roman"/>
+                <w:color w:val="000000"/>
+                <w:sz w:val="24"/>
+                <w:szCs w:val="24"/>
+              </w:rPr>
+            </w:pPr>
+          </w:p>
+        </w:tc>
+        <w:tc>
+          <w:tcPr>
+            <w:tcW w:w="1052" w:type="dxa"/>
+            <w:shd w:val="clear" w:color="auto" w:fill="auto"/>
+            <w:vAlign w:val="center"/>
+          </w:tcPr>
+          <w:p>
+            <w:pPr>
+              <w:rPr>
+                <w:rFonts w:eastAsia="Times New Roman"/>
+                <w:color w:val="000000"/>
+                <w:sz w:val="24"/>
+                <w:szCs w:val="24"/>
+              </w:rPr>
+            </w:pPr>
           </w:p>
         </w:tc>
         <w:tc>
@@ -1406,26 +3165,16 @@
             <w:tcW w:w="2630" w:type="dxa"/>
             <w:shd w:val="clear" w:color="auto" w:fill="auto"/>
             <w:vAlign w:val="center"/>
-            <w:hideMark/>
-          </w:tcPr>
-          <w:p>
-            <w:pPr>
-              <w:rPr>
-                <w:rFonts w:eastAsia="Times New Roman"/>
-                <w:color w:val="000000"/>
-                <w:sz w:val="24"/>
-                <w:szCs w:val="24"/>
-              </w:rPr>
-            </w:pPr>
-            <w:r>
-              <w:rPr>
-                <w:rFonts w:eastAsia="Times New Roman"/>
-                <w:color w:val="000000"/>
-                <w:sz w:val="24"/>
-                <w:szCs w:val="24"/>
-              </w:rPr>
-              <w:t> </w:t>
-            </w:r>
+          </w:tcPr>
+          <w:p>
+            <w:pPr>
+              <w:rPr>
+                <w:rFonts w:eastAsia="Times New Roman"/>
+                <w:color w:val="000000"/>
+                <w:sz w:val="24"/>
+                <w:szCs w:val="24"/>
+              </w:rPr>
+            </w:pPr>
           </w:p>
         </w:tc>
         <w:tc>
@@ -1433,46 +3182,106 @@
             <w:tcW w:w="2950" w:type="dxa"/>
             <w:shd w:val="clear" w:color="auto" w:fill="auto"/>
             <w:vAlign w:val="center"/>
-            <w:hideMark/>
-          </w:tcPr>
-          <w:p>
-            <w:pPr>
-              <w:rPr>
-                <w:rFonts w:eastAsia="Times New Roman"/>
-                <w:color w:val="000000"/>
-                <w:sz w:val="24"/>
-                <w:szCs w:val="24"/>
-              </w:rPr>
-            </w:pPr>
-            <w:r>
-              <w:rPr>
-                <w:rFonts w:eastAsia="Times New Roman"/>
-                <w:color w:val="000000"/>
-                <w:sz w:val="24"/>
-                <w:szCs w:val="24"/>
-              </w:rPr>
-              <w:t xml:space="preserve">Please check if this is a restricted course in the partner university. Also, please note that you have to fulfil the prescribe NUS’ </w:t>
-            </w:r>
-            <w:proofErr w:type="gramStart"/>
-            <w:r>
-              <w:rPr>
-                <w:rFonts w:eastAsia="Times New Roman"/>
-                <w:color w:val="000000"/>
-                <w:sz w:val="24"/>
-                <w:szCs w:val="24"/>
-              </w:rPr>
-              <w:t>pre requisites</w:t>
-            </w:r>
-            <w:proofErr w:type="gramEnd"/>
-            <w:r>
-              <w:rPr>
-                <w:rFonts w:eastAsia="Times New Roman"/>
-                <w:color w:val="000000"/>
-                <w:sz w:val="24"/>
-                <w:szCs w:val="24"/>
-              </w:rPr>
-              <w:t xml:space="preserve"> before you read the courses during your exchange. </w:t>
-            </w:r>
+          </w:tcPr>
+          <w:p>
+            <w:pPr>
+              <w:rPr>
+                <w:rFonts w:eastAsia="Times New Roman"/>
+                <w:color w:val="000000"/>
+                <w:sz w:val="24"/>
+                <w:szCs w:val="24"/>
+              </w:rPr>
+            </w:pPr>
+          </w:p>
+        </w:tc>
+      </w:tr>
+      <w:tr>
+        <w:trPr>
+          <w:trHeight w:val="1572"/>
+        </w:trPr>
+        <w:tc>
+          <w:tcPr>
+            <w:tcW w:w="1520" w:type="dxa"/>
+            <w:shd w:val="clear" w:color="auto" w:fill="auto"/>
+            <w:vAlign w:val="center"/>
+          </w:tcPr>
+          <w:p>
+            <w:pPr>
+              <w:rPr>
+                <w:rFonts w:eastAsia="Times New Roman"/>
+                <w:color w:val="000000"/>
+                <w:sz w:val="24"/>
+                <w:szCs w:val="24"/>
+              </w:rPr>
+            </w:pPr>
+          </w:p>
+        </w:tc>
+        <w:tc>
+          <w:tcPr>
+            <w:tcW w:w="1766" w:type="dxa"/>
+            <w:shd w:val="clear" w:color="auto" w:fill="auto"/>
+            <w:vAlign w:val="center"/>
+          </w:tcPr>
+          <w:p>
+            <w:pPr>
+              <w:rPr>
+                <w:rFonts w:eastAsia="Times New Roman"/>
+                <w:color w:val="000000"/>
+                <w:sz w:val="24"/>
+                <w:szCs w:val="24"/>
+              </w:rPr>
+            </w:pPr>
+          </w:p>
+        </w:tc>
+        <w:tc>
+          <w:tcPr>
+            <w:tcW w:w="1052" w:type="dxa"/>
+            <w:shd w:val="clear" w:color="auto" w:fill="auto"/>
+            <w:vAlign w:val="center"/>
+          </w:tcPr>
+          <w:p>
+            <w:pPr>
+              <w:rPr>
+                <w:rFonts w:eastAsia="Times New Roman"/>
+                <w:color w:val="000000"/>
+                <w:sz w:val="24"/>
+                <w:szCs w:val="24"/>
+              </w:rPr>
+            </w:pPr>
+          </w:p>
+        </w:tc>
+        <w:tc>
+          <w:tcPr>
+            <w:tcW w:w="2630" w:type="dxa"/>
+            <w:shd w:val="clear" w:color="auto" w:fill="auto"/>
+            <w:vAlign w:val="center"/>
+          </w:tcPr>
+          <w:p>
+            <w:pPr>
+              <w:rPr>
+                <w:rFonts w:eastAsia="Times New Roman"/>
+                <w:color w:val="000000"/>
+                <w:sz w:val="24"/>
+                <w:szCs w:val="24"/>
+              </w:rPr>
+            </w:pPr>
+          </w:p>
+        </w:tc>
+        <w:tc>
+          <w:tcPr>
+            <w:tcW w:w="2950" w:type="dxa"/>
+            <w:shd w:val="clear" w:color="auto" w:fill="auto"/>
+            <w:vAlign w:val="center"/>
+          </w:tcPr>
+          <w:p>
+            <w:pPr>
+              <w:rPr>
+                <w:rFonts w:eastAsia="Times New Roman"/>
+                <w:color w:val="000000"/>
+                <w:sz w:val="24"/>
+                <w:szCs w:val="24"/>
+              </w:rPr>
+            </w:pPr>
           </w:p>
         </w:tc>
       </w:tr>
@@ -1914,27 +3723,7 @@
                 <w:sz w:val="24"/>
                 <w:szCs w:val="24"/>
               </w:rPr>
-              <w:t xml:space="preserve">Please check if this is a restricted course in the partner university. Also, please note that you have to fulfil the prescribe NUS’ </w:t>
-            </w:r>
-            <w:proofErr w:type="gramStart"/>
-            <w:r>
-              <w:rPr>
-                <w:rFonts w:eastAsia="Times New Roman"/>
-                <w:color w:val="000000"/>
-                <w:sz w:val="24"/>
-                <w:szCs w:val="24"/>
-              </w:rPr>
-              <w:t>pre requisites</w:t>
-            </w:r>
-            <w:proofErr w:type="gramEnd"/>
-            <w:r>
-              <w:rPr>
-                <w:rFonts w:eastAsia="Times New Roman"/>
-                <w:color w:val="000000"/>
-                <w:sz w:val="24"/>
-                <w:szCs w:val="24"/>
-              </w:rPr>
-              <w:t xml:space="preserve"> before you read the courses during your exchange. </w:t>
+              <w:t xml:space="preserve">Please check if this is a restricted course in the partner university. Also, please note that you have to fulfil the prescribe NUS’ pre requisites before you read the courses during your exchange. </w:t>
             </w:r>
           </w:p>
         </w:tc>
@@ -2345,27 +4134,7 @@
                 <w:sz w:val="24"/>
                 <w:szCs w:val="24"/>
               </w:rPr>
-              <w:t xml:space="preserve">Please check if this is a restricted course in the partner university. Also, please note that you have to fulfil the prescribe NUS’ </w:t>
-            </w:r>
-            <w:proofErr w:type="gramStart"/>
-            <w:r>
-              <w:rPr>
-                <w:rFonts w:eastAsia="Times New Roman"/>
-                <w:color w:val="000000"/>
-                <w:sz w:val="24"/>
-                <w:szCs w:val="24"/>
-              </w:rPr>
-              <w:t>pre requisites</w:t>
-            </w:r>
-            <w:proofErr w:type="gramEnd"/>
-            <w:r>
-              <w:rPr>
-                <w:rFonts w:eastAsia="Times New Roman"/>
-                <w:color w:val="000000"/>
-                <w:sz w:val="24"/>
-                <w:szCs w:val="24"/>
-              </w:rPr>
-              <w:t xml:space="preserve"> before you read the courses during your exchange. </w:t>
+              <w:t xml:space="preserve">Please check if this is a restricted course in the partner university. Also, please note that you have to fulfil the prescribe NUS’ pre requisites before you read the courses during your exchange. </w:t>
             </w:r>
           </w:p>
         </w:tc>
@@ -2383,7 +4152,7 @@
 </file>
 
 <file path=word/styles.xml><?xml version="1.0" encoding="utf-8"?>
-<w:styles xmlns:mc="http://schemas.openxmlformats.org/markup-compatibility/2006" xmlns:r="http://schemas.openxmlformats.org/officeDocument/2006/relationships" xmlns:w="http://schemas.openxmlformats.org/wordprocessingml/2006/main" xmlns:w14="http://schemas.microsoft.com/office/word/2010/wordml" xmlns:w15="http://schemas.microsoft.com/office/word/2012/wordml" xmlns:w16cex="http://schemas.microsoft.com/office/word/2018/wordml/cex" xmlns:w16cid="http://schemas.microsoft.com/office/word/2016/wordml/cid" xmlns:w16="http://schemas.microsoft.com/office/word/2018/wordml" xmlns:w16sdtdh="http://schemas.microsoft.com/office/word/2020/wordml/sdtdatahash" xmlns:w16se="http://schemas.microsoft.com/office/word/2015/wordml/symex" mc:Ignorable="w14 w15 w16se w16cid w16 w16cex w16sdtdh">
+<w:styles xmlns:mc="http://schemas.openxmlformats.org/markup-compatibility/2006" xmlns:r="http://schemas.openxmlformats.org/officeDocument/2006/relationships" xmlns:w="http://schemas.openxmlformats.org/wordprocessingml/2006/main" xmlns:w14="http://schemas.microsoft.com/office/word/2010/wordml" xmlns:w15="http://schemas.microsoft.com/office/word/2012/wordml" xmlns:w16cex="http://schemas.microsoft.com/office/word/2018/wordml/cex" xmlns:w16cid="http://schemas.microsoft.com/office/word/2016/wordml/cid" xmlns:w16="http://schemas.microsoft.com/office/word/2018/wordml" xmlns:w16du="http://schemas.microsoft.com/office/word/2023/wordml/word16du" xmlns:w16sdtdh="http://schemas.microsoft.com/office/word/2020/wordml/sdtdatahash" xmlns:w16se="http://schemas.microsoft.com/office/word/2015/wordml/symex" mc:Ignorable="w14 w15 w16se w16cid w16 w16cex w16sdtdh w16du">
   <w:docDefaults>
     <w:rPrDefault>
       <w:rPr>
@@ -2791,7 +4560,6 @@
   <w:style w:type="character" w:default="1" w:styleId="DefaultParagraphFont">
     <w:name w:val="Default Paragraph Font"/>
     <w:uiPriority w:val="1"/>
-    <w:semiHidden/>
     <w:unhideWhenUsed/>
   </w:style>
   <w:style w:type="table" w:default="1" w:styleId="TableNormal">

</xml_diff>